<commit_message>
Minor edit to export forms
</commit_message>
<xml_diff>
--- a/exports/export_2024-09-23_tommy/hren9469_data_export_Standardform output or export_2108.docx
+++ b/exports/export_2024-09-23_tommy/hren9469_data_export_Standardform output or export_2108.docx
@@ -1,6 +1,6 @@
 
 <file path=word/document.xml><?xml version="1.0" encoding="utf-8"?>
-<w:document xmlns:wpc="http://schemas.microsoft.com/office/word/2010/wordprocessingCanvas" xmlns:cx="http://schemas.microsoft.com/office/drawing/2014/chartex" xmlns:cx1="http://schemas.microsoft.com/office/drawing/2015/9/8/chartex" xmlns:mc="http://schemas.openxmlformats.org/markup-compatibility/2006" xmlns:o="urn:schemas-microsoft-com:office:office" xmlns:r="http://schemas.openxmlformats.org/officeDocument/2006/relationships" xmlns:m="http://schemas.openxmlformats.org/officeDocument/2006/math" xmlns:v="urn:schemas-microsoft-com:vml" xmlns:wp14="http://schemas.microsoft.com/office/word/2010/wordprocessingDrawing" xmlns:wp="http://schemas.openxmlformats.org/drawingml/2006/wordprocessingDrawing" xmlns:w10="urn:schemas-microsoft-com:office:word" xmlns:w="http://schemas.openxmlformats.org/wordprocessingml/2006/main" xmlns:w14="http://schemas.microsoft.com/office/word/2010/wordml" xmlns:w15="http://schemas.microsoft.com/office/word/2012/wordml" xmlns:w16se="http://schemas.microsoft.com/office/word/2015/wordml/symex" xmlns:wpg="http://schemas.microsoft.com/office/word/2010/wordprocessingGroup" xmlns:wpi="http://schemas.microsoft.com/office/word/2010/wordprocessingInk" xmlns:wne="http://schemas.microsoft.com/office/word/2006/wordml" xmlns:wps="http://schemas.microsoft.com/office/word/2010/wordprocessingShape" mc:Ignorable="w14 w15 w16se wp14">
+<w:document xmlns:wpc="http://schemas.microsoft.com/office/word/2010/wordprocessingCanvas" xmlns:cx="http://schemas.microsoft.com/office/drawing/2014/chartex" xmlns:cx1="http://schemas.microsoft.com/office/drawing/2015/9/8/chartex" xmlns:cx2="http://schemas.microsoft.com/office/drawing/2015/10/21/chartex" xmlns:cx3="http://schemas.microsoft.com/office/drawing/2016/5/9/chartex" xmlns:cx4="http://schemas.microsoft.com/office/drawing/2016/5/10/chartex" xmlns:cx5="http://schemas.microsoft.com/office/drawing/2016/5/11/chartex" xmlns:cx6="http://schemas.microsoft.com/office/drawing/2016/5/12/chartex" xmlns:cx7="http://schemas.microsoft.com/office/drawing/2016/5/13/chartex" xmlns:cx8="http://schemas.microsoft.com/office/drawing/2016/5/14/chartex" xmlns:mc="http://schemas.openxmlformats.org/markup-compatibility/2006" xmlns:aink="http://schemas.microsoft.com/office/drawing/2016/ink" xmlns:am3d="http://schemas.microsoft.com/office/drawing/2017/model3d" xmlns:o="urn:schemas-microsoft-com:office:office" xmlns:oel="http://schemas.microsoft.com/office/2019/extlst" xmlns:r="http://schemas.openxmlformats.org/officeDocument/2006/relationships" xmlns:m="http://schemas.openxmlformats.org/officeDocument/2006/math" xmlns:v="urn:schemas-microsoft-com:vml" xmlns:wp14="http://schemas.microsoft.com/office/word/2010/wordprocessingDrawing" xmlns:wp="http://schemas.openxmlformats.org/drawingml/2006/wordprocessingDrawing" xmlns:w10="urn:schemas-microsoft-com:office:word" xmlns:w="http://schemas.openxmlformats.org/wordprocessingml/2006/main" xmlns:w14="http://schemas.microsoft.com/office/word/2010/wordml" xmlns:w15="http://schemas.microsoft.com/office/word/2012/wordml" xmlns:w16cex="http://schemas.microsoft.com/office/word/2018/wordml/cex" xmlns:w16cid="http://schemas.microsoft.com/office/word/2016/wordml/cid" xmlns:w16="http://schemas.microsoft.com/office/word/2018/wordml" xmlns:w16du="http://schemas.microsoft.com/office/word/2023/wordml/word16du" xmlns:w16sdtdh="http://schemas.microsoft.com/office/word/2020/wordml/sdtdatahash" xmlns:w16sdtfl="http://schemas.microsoft.com/office/word/2024/wordml/sdtformatlock" xmlns:w16se="http://schemas.microsoft.com/office/word/2015/wordml/symex" xmlns:wpg="http://schemas.microsoft.com/office/word/2010/wordprocessingGroup" xmlns:wpi="http://schemas.microsoft.com/office/word/2010/wordprocessingInk" xmlns:wne="http://schemas.microsoft.com/office/word/2006/wordml" xmlns:wps="http://schemas.microsoft.com/office/word/2010/wordprocessingShape" mc:Ignorable="w14 w15 w16se w16cid w16 w16cex w16sdtdh w16sdtfl w16du wp14">
   <w:body>
     <w:p>
       <w:pPr>
@@ -63,7 +63,6 @@
         <w:tc>
           <w:tcPr>
             <w:tcW w:w="5040" w:type="dxa"/>
-            <w:shd w:val="clear" w:color="auto" w:fill="auto"/>
           </w:tcPr>
           <w:p>
             <w:pPr>
@@ -82,39 +81,7 @@
                 <w:rFonts w:ascii="Arial" w:hAnsi="Arial" w:cs="Arial"/>
                 <w:i/>
               </w:rPr>
-              <w:t>[</w:t>
-            </w:r>
-            <w:proofErr w:type="spellStart"/>
-            <w:r>
-              <w:rPr>
-                <w:rFonts w:ascii="Arial" w:hAnsi="Arial" w:cs="Arial"/>
-                <w:i/>
-              </w:rPr>
-              <w:t>name</w:t>
-            </w:r>
-            <w:proofErr w:type="spellEnd"/>
-            <w:r>
-              <w:rPr>
-                <w:rFonts w:ascii="Arial" w:hAnsi="Arial" w:cs="Arial"/>
-                <w:i/>
-              </w:rPr>
-              <w:t xml:space="preserve"> </w:t>
-            </w:r>
-            <w:proofErr w:type="spellStart"/>
-            <w:r>
-              <w:rPr>
-                <w:rFonts w:ascii="Arial" w:hAnsi="Arial" w:cs="Arial"/>
-                <w:i/>
-              </w:rPr>
-              <w:t>user</w:t>
-            </w:r>
-            <w:proofErr w:type="spellEnd"/>
-            <w:r>
-              <w:rPr>
-                <w:rFonts w:ascii="Arial" w:hAnsi="Arial" w:cs="Arial"/>
-                <w:i/>
-              </w:rPr>
-              <w:t>]</w:t>
+              <w:t>[name user]</w:t>
             </w:r>
             <w:r>
               <w:rPr>
@@ -128,7 +95,6 @@
         <w:tc>
           <w:tcPr>
             <w:tcW w:w="4320" w:type="dxa"/>
-            <w:shd w:val="clear" w:color="auto" w:fill="auto"/>
           </w:tcPr>
           <w:p>
             <w:pPr>
@@ -136,19 +102,11 @@
                 <w:rFonts w:ascii="Arial" w:hAnsi="Arial" w:cs="Arial"/>
               </w:rPr>
             </w:pPr>
-            <w:proofErr w:type="spellStart"/>
-            <w:r>
-              <w:rPr>
-                <w:rFonts w:ascii="Arial" w:hAnsi="Arial" w:cs="Arial"/>
-              </w:rPr>
-              <w:t>Hanzhang</w:t>
-            </w:r>
-            <w:proofErr w:type="spellEnd"/>
-            <w:r>
-              <w:rPr>
-                <w:rFonts w:ascii="Arial" w:hAnsi="Arial" w:cs="Arial"/>
-              </w:rPr>
-              <w:t xml:space="preserve"> Ren</w:t>
+            <w:r>
+              <w:rPr>
+                <w:rFonts w:ascii="Arial" w:hAnsi="Arial" w:cs="Arial"/>
+              </w:rPr>
+              <w:t>Hanzhang Ren</w:t>
             </w:r>
           </w:p>
         </w:tc>
@@ -157,7 +115,6 @@
         <w:tc>
           <w:tcPr>
             <w:tcW w:w="5040" w:type="dxa"/>
-            <w:shd w:val="clear" w:color="auto" w:fill="auto"/>
           </w:tcPr>
           <w:p>
             <w:pPr>
@@ -242,7 +199,6 @@
         <w:tc>
           <w:tcPr>
             <w:tcW w:w="4320" w:type="dxa"/>
-            <w:shd w:val="clear" w:color="auto" w:fill="auto"/>
           </w:tcPr>
           <w:p>
             <w:pPr>
@@ -256,14 +212,7 @@
                 <w:rFonts w:ascii="Arial" w:hAnsi="Arial" w:cs="Arial"/>
                 <w:lang w:val="en-GB"/>
               </w:rPr>
-              <w:t xml:space="preserve">+1 203 285 </w:t>
-            </w:r>
-            <w:r>
-              <w:rPr>
-                <w:rFonts w:ascii="Arial" w:hAnsi="Arial" w:cs="Arial"/>
-                <w:lang w:val="en-GB"/>
-              </w:rPr>
-              <w:t>7184</w:t>
+              <w:t>REDACTED</w:t>
             </w:r>
           </w:p>
         </w:tc>
@@ -272,7 +221,6 @@
         <w:tc>
           <w:tcPr>
             <w:tcW w:w="5040" w:type="dxa"/>
-            <w:shd w:val="clear" w:color="auto" w:fill="auto"/>
           </w:tcPr>
           <w:p>
             <w:pPr>
@@ -291,39 +239,7 @@
                 <w:rFonts w:ascii="Arial" w:hAnsi="Arial" w:cs="Arial"/>
                 <w:i/>
               </w:rPr>
-              <w:t>[</w:t>
-            </w:r>
-            <w:proofErr w:type="spellStart"/>
-            <w:r>
-              <w:rPr>
-                <w:rFonts w:ascii="Arial" w:hAnsi="Arial" w:cs="Arial"/>
-                <w:i/>
-              </w:rPr>
-              <w:t>name</w:t>
-            </w:r>
-            <w:proofErr w:type="spellEnd"/>
-            <w:r>
-              <w:rPr>
-                <w:rFonts w:ascii="Arial" w:hAnsi="Arial" w:cs="Arial"/>
-                <w:i/>
-              </w:rPr>
-              <w:t xml:space="preserve"> </w:t>
-            </w:r>
-            <w:proofErr w:type="spellStart"/>
-            <w:r>
-              <w:rPr>
-                <w:rFonts w:ascii="Arial" w:hAnsi="Arial" w:cs="Arial"/>
-                <w:i/>
-              </w:rPr>
-              <w:t>institution</w:t>
-            </w:r>
-            <w:proofErr w:type="spellEnd"/>
-            <w:r>
-              <w:rPr>
-                <w:rFonts w:ascii="Arial" w:hAnsi="Arial" w:cs="Arial"/>
-                <w:i/>
-              </w:rPr>
-              <w:t>]</w:t>
+              <w:t>[name institution]</w:t>
             </w:r>
             <w:r>
               <w:rPr>
@@ -337,7 +253,6 @@
         <w:tc>
           <w:tcPr>
             <w:tcW w:w="4320" w:type="dxa"/>
-            <w:shd w:val="clear" w:color="auto" w:fill="auto"/>
           </w:tcPr>
           <w:p>
             <w:pPr>
@@ -345,19 +260,11 @@
                 <w:rFonts w:ascii="Arial" w:hAnsi="Arial" w:cs="Arial"/>
               </w:rPr>
             </w:pPr>
-            <w:proofErr w:type="spellStart"/>
-            <w:r>
-              <w:rPr>
-                <w:rFonts w:ascii="Arial" w:hAnsi="Arial" w:cs="Arial"/>
-              </w:rPr>
-              <w:t>Rijksuniversiteit</w:t>
-            </w:r>
-            <w:proofErr w:type="spellEnd"/>
-            <w:r>
-              <w:rPr>
-                <w:rFonts w:ascii="Arial" w:hAnsi="Arial" w:cs="Arial"/>
-              </w:rPr>
-              <w:t xml:space="preserve"> Groningen</w:t>
+            <w:r>
+              <w:rPr>
+                <w:rFonts w:ascii="Arial" w:hAnsi="Arial" w:cs="Arial"/>
+              </w:rPr>
+              <w:t>Rijksuniversiteit Groningen</w:t>
             </w:r>
           </w:p>
         </w:tc>
@@ -366,7 +273,6 @@
         <w:tc>
           <w:tcPr>
             <w:tcW w:w="5040" w:type="dxa"/>
-            <w:shd w:val="clear" w:color="auto" w:fill="auto"/>
           </w:tcPr>
           <w:p>
             <w:pPr>
@@ -403,7 +309,6 @@
         <w:tc>
           <w:tcPr>
             <w:tcW w:w="4320" w:type="dxa"/>
-            <w:shd w:val="clear" w:color="auto" w:fill="auto"/>
           </w:tcPr>
           <w:p>
             <w:pPr>
@@ -440,7 +345,6 @@
         <w:tc>
           <w:tcPr>
             <w:tcW w:w="5040" w:type="dxa"/>
-            <w:shd w:val="clear" w:color="auto" w:fill="auto"/>
           </w:tcPr>
           <w:p>
             <w:pPr>
@@ -459,55 +363,7 @@
                 <w:rFonts w:ascii="Arial" w:hAnsi="Arial" w:cs="Arial"/>
                 <w:i/>
               </w:rPr>
-              <w:t>[</w:t>
-            </w:r>
-            <w:proofErr w:type="spellStart"/>
-            <w:r>
-              <w:rPr>
-                <w:rFonts w:ascii="Arial" w:hAnsi="Arial" w:cs="Arial"/>
-                <w:i/>
-              </w:rPr>
-              <w:t>contractnumber</w:t>
-            </w:r>
-            <w:proofErr w:type="spellEnd"/>
-            <w:r>
-              <w:rPr>
-                <w:rFonts w:ascii="Arial" w:hAnsi="Arial" w:cs="Arial"/>
-                <w:i/>
-              </w:rPr>
-              <w:t xml:space="preserve"> + </w:t>
-            </w:r>
-            <w:proofErr w:type="spellStart"/>
-            <w:r>
-              <w:rPr>
-                <w:rFonts w:ascii="Arial" w:hAnsi="Arial" w:cs="Arial"/>
-                <w:i/>
-              </w:rPr>
-              <w:t>name</w:t>
-            </w:r>
-            <w:proofErr w:type="spellEnd"/>
-            <w:r>
-              <w:rPr>
-                <w:rFonts w:ascii="Arial" w:hAnsi="Arial" w:cs="Arial"/>
-                <w:i/>
-              </w:rPr>
-              <w:t xml:space="preserve"> </w:t>
-            </w:r>
-            <w:proofErr w:type="spellStart"/>
-            <w:r>
-              <w:rPr>
-                <w:rFonts w:ascii="Arial" w:hAnsi="Arial" w:cs="Arial"/>
-                <w:i/>
-              </w:rPr>
-              <w:t>research</w:t>
-            </w:r>
-            <w:proofErr w:type="spellEnd"/>
-            <w:r>
-              <w:rPr>
-                <w:rFonts w:ascii="Arial" w:hAnsi="Arial" w:cs="Arial"/>
-                <w:i/>
-              </w:rPr>
-              <w:t>]</w:t>
+              <w:t>[contractnumber + name research]</w:t>
             </w:r>
             <w:r>
               <w:rPr>
@@ -521,7 +377,6 @@
         <w:tc>
           <w:tcPr>
             <w:tcW w:w="4320" w:type="dxa"/>
-            <w:shd w:val="clear" w:color="auto" w:fill="auto"/>
           </w:tcPr>
           <w:p>
             <w:pPr>
@@ -549,30 +404,14 @@
                 <w:rFonts w:ascii="Arial" w:hAnsi="Arial" w:cs="Arial"/>
                 <w:lang w:val="en-US"/>
               </w:rPr>
-              <w:t xml:space="preserve"> Predicting Fertility Data Challenge (</w:t>
-            </w:r>
-            <w:proofErr w:type="spellStart"/>
-            <w:r>
-              <w:rPr>
-                <w:rFonts w:ascii="Arial" w:hAnsi="Arial" w:cs="Arial"/>
-                <w:lang w:val="en-US"/>
-              </w:rPr>
-              <w:t>P</w:t>
-            </w:r>
-            <w:r>
-              <w:rPr>
-                <w:rFonts w:ascii="Arial" w:hAnsi="Arial" w:cs="Arial"/>
-                <w:lang w:val="en-US"/>
-              </w:rPr>
-              <w:t>reFer</w:t>
-            </w:r>
-            <w:proofErr w:type="spellEnd"/>
-            <w:r>
-              <w:rPr>
-                <w:rFonts w:ascii="Arial" w:hAnsi="Arial" w:cs="Arial"/>
-                <w:lang w:val="en-US"/>
-              </w:rPr>
-              <w:t>)</w:t>
+              <w:t xml:space="preserve"> Predicting Fertility Data Challenge (P</w:t>
+            </w:r>
+            <w:r>
+              <w:rPr>
+                <w:rFonts w:ascii="Arial" w:hAnsi="Arial" w:cs="Arial"/>
+                <w:lang w:val="en-US"/>
+              </w:rPr>
+              <w:t>reFer)</w:t>
             </w:r>
           </w:p>
         </w:tc>
@@ -581,7 +420,6 @@
         <w:tc>
           <w:tcPr>
             <w:tcW w:w="5040" w:type="dxa"/>
-            <w:shd w:val="clear" w:color="auto" w:fill="auto"/>
           </w:tcPr>
           <w:p>
             <w:pPr>
@@ -673,7 +511,6 @@
         <w:tc>
           <w:tcPr>
             <w:tcW w:w="4320" w:type="dxa"/>
-            <w:shd w:val="clear" w:color="auto" w:fill="auto"/>
           </w:tcPr>
           <w:p>
             <w:pPr>
@@ -696,7 +533,6 @@
         <w:tc>
           <w:tcPr>
             <w:tcW w:w="5040" w:type="dxa"/>
-            <w:shd w:val="clear" w:color="auto" w:fill="auto"/>
           </w:tcPr>
           <w:p>
             <w:pPr>
@@ -738,7 +574,6 @@
         <w:tc>
           <w:tcPr>
             <w:tcW w:w="4320" w:type="dxa"/>
-            <w:shd w:val="clear" w:color="auto" w:fill="auto"/>
           </w:tcPr>
           <w:p>
             <w:pPr>
@@ -761,7 +596,6 @@
         <w:tc>
           <w:tcPr>
             <w:tcW w:w="5040" w:type="dxa"/>
-            <w:shd w:val="clear" w:color="auto" w:fill="auto"/>
           </w:tcPr>
           <w:p>
             <w:pPr>
@@ -814,7 +648,6 @@
         <w:tc>
           <w:tcPr>
             <w:tcW w:w="4320" w:type="dxa"/>
-            <w:shd w:val="clear" w:color="auto" w:fill="auto"/>
           </w:tcPr>
           <w:p>
             <w:pPr>
@@ -828,39 +661,7 @@
                 <w:rFonts w:ascii="Arial" w:hAnsi="Arial" w:cs="Arial"/>
                 <w:lang w:val="en-GB"/>
               </w:rPr>
-              <w:t xml:space="preserve">We used the </w:t>
-            </w:r>
-            <w:proofErr w:type="spellStart"/>
-            <w:r>
-              <w:rPr>
-                <w:rFonts w:ascii="Arial" w:hAnsi="Arial" w:cs="Arial"/>
-                <w:lang w:val="en-GB"/>
-              </w:rPr>
-              <w:t>catboost</w:t>
-            </w:r>
-            <w:proofErr w:type="spellEnd"/>
-            <w:r>
-              <w:rPr>
-                <w:rFonts w:ascii="Arial" w:hAnsi="Arial" w:cs="Arial"/>
-                <w:lang w:val="en-GB"/>
-              </w:rPr>
-              <w:t xml:space="preserve"> package to write a machine learning algorithm that predicts whether Dutch individuals between 18 and 45 would have a child between 2021 and 2023, using data up until 2020. This outcome that we predict is a variable constructed by Lisa </w:t>
-            </w:r>
-            <w:proofErr w:type="spellStart"/>
-            <w:r>
-              <w:rPr>
-                <w:rFonts w:ascii="Arial" w:hAnsi="Arial" w:cs="Arial"/>
-                <w:lang w:val="en-GB"/>
-              </w:rPr>
-              <w:t>Sivak</w:t>
-            </w:r>
-            <w:proofErr w:type="spellEnd"/>
-            <w:r>
-              <w:rPr>
-                <w:rFonts w:ascii="Arial" w:hAnsi="Arial" w:cs="Arial"/>
-                <w:lang w:val="en-GB"/>
-              </w:rPr>
-              <w:t xml:space="preserve"> using data from GBAPERSOONTAB and </w:t>
+              <w:t xml:space="preserve">We used the catboost package to write a machine learning algorithm that predicts whether Dutch individuals between 18 and 45 would have a child between 2021 and 2023, using data up until 2020. This outcome that we predict is a variable constructed by Lisa Sivak using data from GBAPERSOONTAB and </w:t>
             </w:r>
             <w:r>
               <w:rPr>
@@ -934,37 +735,7 @@
                 <w:rFonts w:ascii="Arial" w:hAnsi="Arial" w:cs="Arial"/>
                 <w:lang w:val="en-GB"/>
               </w:rPr>
-              <w:t xml:space="preserve">examined a set of potential predictors curated by Lisa </w:t>
-            </w:r>
-            <w:proofErr w:type="spellStart"/>
-            <w:r>
-              <w:rPr>
-                <w:rFonts w:ascii="Arial" w:hAnsi="Arial" w:cs="Arial"/>
-                <w:lang w:val="en-GB"/>
-              </w:rPr>
-              <w:t>Sivak</w:t>
-            </w:r>
-            <w:proofErr w:type="spellEnd"/>
-            <w:r>
-              <w:rPr>
-                <w:rFonts w:ascii="Arial" w:hAnsi="Arial" w:cs="Arial"/>
-                <w:lang w:val="en-GB"/>
-              </w:rPr>
-              <w:t xml:space="preserve">. These predictors come from </w:t>
-            </w:r>
-            <w:r>
-              <w:rPr>
-                <w:rFonts w:ascii="Arial" w:hAnsi="Arial" w:cs="Arial"/>
-                <w:lang w:val="en-GB"/>
-              </w:rPr>
-              <w:t>GBAPERSOONTAB</w:t>
-            </w:r>
-            <w:r>
-              <w:rPr>
-                <w:rFonts w:ascii="Arial" w:hAnsi="Arial" w:cs="Arial"/>
-                <w:lang w:val="en-GB"/>
-              </w:rPr>
-              <w:t xml:space="preserve">, KINDOUDERTAB, </w:t>
+              <w:t xml:space="preserve">examined a set of potential predictors curated by Lisa Sivak. These predictors come from GBAPERSOONTAB, KINDOUDERTAB, </w:t>
             </w:r>
             <w:r>
               <w:rPr>
@@ -1098,36 +869,7 @@
                 <w:sz w:val="22"/>
                 <w:szCs w:val="22"/>
               </w:rPr>
-              <w:t>VBOWONINGTYPETAB</w:t>
-            </w:r>
-            <w:r>
-              <w:rPr>
-                <w:rFonts w:ascii="Calibri" w:hAnsi="Calibri" w:cs="Calibri"/>
-                <w:color w:val="000000"/>
-                <w:sz w:val="22"/>
-                <w:szCs w:val="22"/>
-              </w:rPr>
-              <w:t xml:space="preserve">, </w:t>
-            </w:r>
-            <w:proofErr w:type="spellStart"/>
-            <w:r>
-              <w:rPr>
-                <w:rFonts w:ascii="Calibri" w:hAnsi="Calibri" w:cs="Calibri"/>
-                <w:color w:val="000000"/>
-                <w:sz w:val="22"/>
-                <w:szCs w:val="22"/>
-              </w:rPr>
-              <w:t>and</w:t>
-            </w:r>
-            <w:proofErr w:type="spellEnd"/>
-            <w:r>
-              <w:rPr>
-                <w:rFonts w:ascii="Calibri" w:hAnsi="Calibri" w:cs="Calibri"/>
-                <w:color w:val="000000"/>
-                <w:sz w:val="22"/>
-                <w:szCs w:val="22"/>
-              </w:rPr>
-              <w:t xml:space="preserve"> </w:t>
+              <w:t xml:space="preserve">VBOWONINGTYPETAB, and </w:t>
             </w:r>
           </w:p>
           <w:p>
@@ -1175,7 +917,6 @@
         <w:tc>
           <w:tcPr>
             <w:tcW w:w="5040" w:type="dxa"/>
-            <w:shd w:val="clear" w:color="auto" w:fill="auto"/>
           </w:tcPr>
           <w:p>
             <w:pPr>
@@ -1244,7 +985,6 @@
         <w:tc>
           <w:tcPr>
             <w:tcW w:w="4320" w:type="dxa"/>
-            <w:shd w:val="clear" w:color="auto" w:fill="auto"/>
           </w:tcPr>
           <w:p>
             <w:pPr>
@@ -1307,23 +1047,7 @@
                 <w:rFonts w:ascii="Arial" w:hAnsi="Arial" w:cs="Arial"/>
                 <w:lang w:val="en-GB"/>
               </w:rPr>
-              <w:t xml:space="preserve">If someone trains a default </w:t>
-            </w:r>
-            <w:proofErr w:type="spellStart"/>
-            <w:r>
-              <w:rPr>
-                <w:rFonts w:ascii="Arial" w:hAnsi="Arial" w:cs="Arial"/>
-                <w:lang w:val="en-GB"/>
-              </w:rPr>
-              <w:t>catboost</w:t>
-            </w:r>
-            <w:proofErr w:type="spellEnd"/>
-            <w:r>
-              <w:rPr>
-                <w:rFonts w:ascii="Arial" w:hAnsi="Arial" w:cs="Arial"/>
-                <w:lang w:val="en-GB"/>
-              </w:rPr>
-              <w:t xml:space="preserve"> model on increasingly larger random samples of the training data, to what extent do the predictions become more accurate? How does this relationship change depending on the number of features used to train the model</w:t>
+              <w:t>If someone trains a default catboost model on increasingly larger random samples of the training data, to what extent do the predictions become more accurate? How does this relationship change depending on the number of features used to train the model</w:t>
             </w:r>
             <w:r>
               <w:rPr>
@@ -1350,30 +1074,7 @@
                 <w:rFonts w:ascii="Arial" w:hAnsi="Arial" w:cs="Arial"/>
                 <w:lang w:val="en-GB"/>
               </w:rPr>
-              <w:t>If one uses</w:t>
-            </w:r>
-            <w:r>
-              <w:rPr>
-                <w:rFonts w:ascii="Arial" w:hAnsi="Arial" w:cs="Arial"/>
-                <w:lang w:val="en-GB"/>
-              </w:rPr>
-              <w:t xml:space="preserve"> a package like </w:t>
-            </w:r>
-            <w:proofErr w:type="spellStart"/>
-            <w:r>
-              <w:rPr>
-                <w:rFonts w:ascii="Arial" w:hAnsi="Arial" w:cs="Arial"/>
-                <w:lang w:val="en-GB"/>
-              </w:rPr>
-              <w:t>catboost</w:t>
-            </w:r>
-            <w:proofErr w:type="spellEnd"/>
-            <w:r>
-              <w:rPr>
-                <w:rFonts w:ascii="Arial" w:hAnsi="Arial" w:cs="Arial"/>
-                <w:lang w:val="en-GB"/>
-              </w:rPr>
-              <w:t xml:space="preserve"> to train a reasonable machine learning model</w:t>
+              <w:t>If one uses a package like catboost to train a reasonable machine learning model</w:t>
             </w:r>
             <w:r>
               <w:rPr>
@@ -1410,7 +1111,6 @@
         <w:tc>
           <w:tcPr>
             <w:tcW w:w="5040" w:type="dxa"/>
-            <w:shd w:val="clear" w:color="auto" w:fill="auto"/>
           </w:tcPr>
           <w:p>
             <w:pPr>
@@ -1500,7 +1200,6 @@
         <w:tc>
           <w:tcPr>
             <w:tcW w:w="4320" w:type="dxa"/>
-            <w:shd w:val="clear" w:color="auto" w:fill="auto"/>
           </w:tcPr>
           <w:p>
             <w:pPr>
@@ -1537,7 +1236,6 @@
         <w:tc>
           <w:tcPr>
             <w:tcW w:w="5040" w:type="dxa"/>
-            <w:shd w:val="clear" w:color="auto" w:fill="auto"/>
           </w:tcPr>
           <w:p>
             <w:pPr>
@@ -1662,7 +1360,6 @@
         <w:tc>
           <w:tcPr>
             <w:tcW w:w="4320" w:type="dxa"/>
-            <w:shd w:val="clear" w:color="auto" w:fill="auto"/>
           </w:tcPr>
           <w:p>
             <w:pPr>
@@ -1723,23 +1420,7 @@
                 <w:rFonts w:ascii="Arial" w:hAnsi="Arial" w:cs="Arial"/>
                 <w:lang w:val="en-GB"/>
               </w:rPr>
-              <w:t xml:space="preserve">Each row of the csv file corresponds to a default </w:t>
-            </w:r>
-            <w:proofErr w:type="spellStart"/>
-            <w:r>
-              <w:rPr>
-                <w:rFonts w:ascii="Arial" w:hAnsi="Arial" w:cs="Arial"/>
-                <w:lang w:val="en-GB"/>
-              </w:rPr>
-              <w:t>catboost</w:t>
-            </w:r>
-            <w:proofErr w:type="spellEnd"/>
-            <w:r>
-              <w:rPr>
-                <w:rFonts w:ascii="Arial" w:hAnsi="Arial" w:cs="Arial"/>
-                <w:lang w:val="en-GB"/>
-              </w:rPr>
-              <w:t xml:space="preserve"> model trained </w:t>
+              <w:t xml:space="preserve">Each row of the csv file corresponds to a default catboost model trained </w:t>
             </w:r>
             <w:r>
               <w:rPr>
@@ -1835,7 +1516,6 @@
               </w:rPr>
               <w:t>as indicated by the “</w:t>
             </w:r>
-            <w:proofErr w:type="spellStart"/>
             <w:r>
               <w:rPr>
                 <w:rFonts w:ascii="Arial" w:hAnsi="Arial" w:cs="Arial"/>
@@ -1843,7 +1523,6 @@
               </w:rPr>
               <w:t>feature_set</w:t>
             </w:r>
-            <w:proofErr w:type="spellEnd"/>
             <w:r>
               <w:rPr>
                 <w:rFonts w:ascii="Arial" w:hAnsi="Arial" w:cs="Arial"/>
@@ -1929,14 +1608,7 @@
                 <w:rFonts w:ascii="Arial" w:hAnsi="Arial" w:cs="Arial"/>
                 <w:lang w:val="en-GB"/>
               </w:rPr>
-              <w:t xml:space="preserve"> All predictors from </w:t>
-            </w:r>
-            <w:r>
-              <w:rPr>
-                <w:rFonts w:ascii="Arial" w:hAnsi="Arial" w:cs="Arial"/>
-                <w:lang w:val="en-GB"/>
-              </w:rPr>
-              <w:t>GBAPERSOONTAB</w:t>
+              <w:t xml:space="preserve"> All predictors from GBAPERSOONTAB</w:t>
             </w:r>
           </w:p>
           <w:p>
@@ -1958,21 +1630,7 @@
                 <w:rFonts w:ascii="Arial" w:hAnsi="Arial" w:cs="Arial"/>
                 <w:lang w:val="en-GB"/>
               </w:rPr>
-              <w:t xml:space="preserve">3. All predictors from </w:t>
-            </w:r>
-            <w:r>
-              <w:rPr>
-                <w:rFonts w:ascii="Arial" w:hAnsi="Arial" w:cs="Arial"/>
-                <w:lang w:val="en-GB"/>
-              </w:rPr>
-              <w:t>GBAPERSOONTAB</w:t>
-            </w:r>
-            <w:r>
-              <w:rPr>
-                <w:rFonts w:ascii="Arial" w:hAnsi="Arial" w:cs="Arial"/>
-                <w:lang w:val="en-GB"/>
-              </w:rPr>
-              <w:t xml:space="preserve"> and </w:t>
+              <w:t xml:space="preserve">3. All predictors from GBAPERSOONTAB and </w:t>
             </w:r>
             <w:r>
               <w:rPr>
@@ -1992,29 +1650,7 @@
                 <w:szCs w:val="22"/>
                 <w:lang w:val="en-US"/>
               </w:rPr>
-              <w:t>. We call this bundle “</w:t>
-            </w:r>
-            <w:proofErr w:type="spellStart"/>
-            <w:r>
-              <w:rPr>
-                <w:rFonts w:ascii="Calibri" w:hAnsi="Calibri" w:cs="Calibri"/>
-                <w:color w:val="000000"/>
-                <w:sz w:val="22"/>
-                <w:szCs w:val="22"/>
-                <w:lang w:val="en-US"/>
-              </w:rPr>
-              <w:t>key_records</w:t>
-            </w:r>
-            <w:proofErr w:type="spellEnd"/>
-            <w:r>
-              <w:rPr>
-                <w:rFonts w:ascii="Calibri" w:hAnsi="Calibri" w:cs="Calibri"/>
-                <w:color w:val="000000"/>
-                <w:sz w:val="22"/>
-                <w:szCs w:val="22"/>
-                <w:lang w:val="en-US"/>
-              </w:rPr>
-              <w:t>”</w:t>
+              <w:t>. We call this bundle “key_records”</w:t>
             </w:r>
           </w:p>
           <w:p>
@@ -2040,51 +1676,7 @@
                 <w:lang w:val="en-US"/>
               </w:rPr>
               <w:lastRenderedPageBreak/>
-              <w:t xml:space="preserve">4. All of the above plus any features curated by Lisa </w:t>
-            </w:r>
-            <w:proofErr w:type="spellStart"/>
-            <w:r>
-              <w:rPr>
-                <w:rFonts w:ascii="Calibri" w:hAnsi="Calibri" w:cs="Calibri"/>
-                <w:color w:val="000000"/>
-                <w:sz w:val="22"/>
-                <w:szCs w:val="22"/>
-                <w:lang w:val="en-US"/>
-              </w:rPr>
-              <w:t>Sivak</w:t>
-            </w:r>
-            <w:proofErr w:type="spellEnd"/>
-            <w:r>
-              <w:rPr>
-                <w:rFonts w:ascii="Calibri" w:hAnsi="Calibri" w:cs="Calibri"/>
-                <w:color w:val="000000"/>
-                <w:sz w:val="22"/>
-                <w:szCs w:val="22"/>
-                <w:lang w:val="en-US"/>
-              </w:rPr>
-              <w:t>. We call this bundle “</w:t>
-            </w:r>
-            <w:proofErr w:type="spellStart"/>
-            <w:r>
-              <w:rPr>
-                <w:rFonts w:ascii="Calibri" w:hAnsi="Calibri" w:cs="Calibri"/>
-                <w:color w:val="000000"/>
-                <w:sz w:val="22"/>
-                <w:szCs w:val="22"/>
-                <w:lang w:val="en-US"/>
-              </w:rPr>
-              <w:t>augmented_records</w:t>
-            </w:r>
-            <w:proofErr w:type="spellEnd"/>
-            <w:r>
-              <w:rPr>
-                <w:rFonts w:ascii="Calibri" w:hAnsi="Calibri" w:cs="Calibri"/>
-                <w:color w:val="000000"/>
-                <w:sz w:val="22"/>
-                <w:szCs w:val="22"/>
-                <w:lang w:val="en-US"/>
-              </w:rPr>
-              <w:t>.”</w:t>
+              <w:t>4. All of the above plus any features curated by Lisa Sivak. We call this bundle “augmented_records.”</w:t>
             </w:r>
           </w:p>
           <w:p>
@@ -2134,64 +1726,8 @@
                 <w:szCs w:val="22"/>
                 <w:lang w:val="en-US"/>
               </w:rPr>
-              <w:t xml:space="preserve">, as </w:t>
-            </w:r>
-            <w:proofErr w:type="spellStart"/>
-            <w:r>
-              <w:rPr>
-                <w:rFonts w:ascii="Calibri" w:hAnsi="Calibri" w:cs="Calibri"/>
-                <w:color w:val="000000"/>
-                <w:sz w:val="22"/>
-                <w:szCs w:val="22"/>
-                <w:lang w:val="en-US"/>
-              </w:rPr>
-              <w:t>indicatd</w:t>
-            </w:r>
-            <w:proofErr w:type="spellEnd"/>
-            <w:r>
-              <w:rPr>
-                <w:rFonts w:ascii="Calibri" w:hAnsi="Calibri" w:cs="Calibri"/>
-                <w:color w:val="000000"/>
-                <w:sz w:val="22"/>
-                <w:szCs w:val="22"/>
-                <w:lang w:val="en-US"/>
-              </w:rPr>
-              <w:t xml:space="preserve"> by the columns </w:t>
-            </w:r>
-            <w:proofErr w:type="spellStart"/>
-            <w:r>
-              <w:rPr>
-                <w:rFonts w:ascii="Calibri" w:hAnsi="Calibri" w:cs="Calibri"/>
-                <w:color w:val="000000"/>
-                <w:sz w:val="22"/>
-                <w:szCs w:val="22"/>
-                <w:lang w:val="en-US"/>
-              </w:rPr>
-              <w:t>training_set</w:t>
-            </w:r>
-            <w:proofErr w:type="spellEnd"/>
-            <w:r>
-              <w:rPr>
-                <w:rFonts w:ascii="Calibri" w:hAnsi="Calibri" w:cs="Calibri"/>
-                <w:color w:val="000000"/>
-                <w:sz w:val="22"/>
-                <w:szCs w:val="22"/>
-                <w:lang w:val="en-US"/>
-              </w:rPr>
-              <w:t xml:space="preserve"> and </w:t>
-            </w:r>
-            <w:proofErr w:type="spellStart"/>
-            <w:r>
-              <w:rPr>
-                <w:rFonts w:ascii="Calibri" w:hAnsi="Calibri" w:cs="Calibri"/>
-                <w:color w:val="000000"/>
-                <w:sz w:val="22"/>
-                <w:szCs w:val="22"/>
-                <w:lang w:val="en-US"/>
-              </w:rPr>
-              <w:t>n_training_set</w:t>
-            </w:r>
-            <w:proofErr w:type="spellEnd"/>
+              <w:t>, as indicatd by the columns training_set and n_training_set</w:t>
+            </w:r>
             <w:r>
               <w:rPr>
                 <w:rFonts w:ascii="Calibri" w:hAnsi="Calibri" w:cs="Calibri"/>
@@ -2440,20 +1976,8 @@
                 <w:szCs w:val="22"/>
                 <w:lang w:val="en-US"/>
               </w:rPr>
-              <w:t xml:space="preserve">3696041. Maximum number of people in the training data prepared by Lisa </w:t>
-            </w:r>
-            <w:proofErr w:type="spellStart"/>
-            <w:r>
-              <w:rPr>
-                <w:rFonts w:ascii="Calibri" w:hAnsi="Calibri" w:cs="Calibri"/>
-                <w:color w:val="000000"/>
-                <w:sz w:val="22"/>
-                <w:szCs w:val="22"/>
-                <w:lang w:val="en-US"/>
-              </w:rPr>
-              <w:t>Sivak</w:t>
-            </w:r>
-            <w:proofErr w:type="spellEnd"/>
+              <w:t>3696041. Maximum number of people in the training data prepared by Lisa Sivak</w:t>
+            </w:r>
             <w:r>
               <w:rPr>
                 <w:rFonts w:ascii="Calibri" w:hAnsi="Calibri" w:cs="Calibri"/>
@@ -2588,18 +2112,7 @@
                 <w:szCs w:val="22"/>
                 <w:lang w:val="en-US"/>
               </w:rPr>
-              <w:t xml:space="preserve">are 2 options for the </w:t>
-            </w:r>
-            <w:proofErr w:type="spellStart"/>
-            <w:r>
-              <w:rPr>
-                <w:rFonts w:ascii="Calibri" w:hAnsi="Calibri" w:cs="Calibri"/>
-                <w:color w:val="000000"/>
-                <w:sz w:val="22"/>
-                <w:szCs w:val="22"/>
-                <w:lang w:val="en-US"/>
-              </w:rPr>
-              <w:t>evaluation_</w:t>
+              <w:t>are 2 options for the evaluation_</w:t>
             </w:r>
             <w:r>
               <w:rPr>
@@ -2611,7 +2124,6 @@
               </w:rPr>
               <w:t>set</w:t>
             </w:r>
-            <w:proofErr w:type="spellEnd"/>
             <w:r>
               <w:rPr>
                 <w:rFonts w:ascii="Calibri" w:hAnsi="Calibri" w:cs="Calibri"/>
@@ -2706,29 +2218,7 @@
                 <w:szCs w:val="22"/>
                 <w:lang w:val="en-US"/>
               </w:rPr>
-              <w:t xml:space="preserve"> prepared by Lisa </w:t>
-            </w:r>
-            <w:proofErr w:type="spellStart"/>
-            <w:r>
-              <w:rPr>
-                <w:rFonts w:ascii="Calibri" w:hAnsi="Calibri" w:cs="Calibri"/>
-                <w:color w:val="000000"/>
-                <w:sz w:val="22"/>
-                <w:szCs w:val="22"/>
-                <w:lang w:val="en-US"/>
-              </w:rPr>
-              <w:t>Sivak</w:t>
-            </w:r>
-            <w:proofErr w:type="spellEnd"/>
-            <w:r>
-              <w:rPr>
-                <w:rFonts w:ascii="Calibri" w:hAnsi="Calibri" w:cs="Calibri"/>
-                <w:color w:val="000000"/>
-                <w:sz w:val="22"/>
-                <w:szCs w:val="22"/>
-                <w:lang w:val="en-US"/>
-              </w:rPr>
-              <w:t>.</w:t>
+              <w:t xml:space="preserve"> prepared by Lisa Sivak.</w:t>
             </w:r>
             <w:r>
               <w:rPr>
@@ -2758,20 +2248,8 @@
                 <w:szCs w:val="22"/>
                 <w:lang w:val="en-US"/>
               </w:rPr>
-              <w:t xml:space="preserve">half of the </w:t>
-            </w:r>
-            <w:proofErr w:type="spellStart"/>
-            <w:r>
-              <w:rPr>
-                <w:rFonts w:ascii="Calibri" w:hAnsi="Calibri" w:cs="Calibri"/>
-                <w:color w:val="000000"/>
-                <w:sz w:val="22"/>
-                <w:szCs w:val="22"/>
-                <w:lang w:val="en-US"/>
-              </w:rPr>
-              <w:t>evaluation_set</w:t>
-            </w:r>
-            <w:proofErr w:type="spellEnd"/>
+              <w:t>half of the evaluation_set</w:t>
+            </w:r>
             <w:r>
               <w:rPr>
                 <w:rFonts w:ascii="Calibri" w:hAnsi="Calibri" w:cs="Calibri"/>
@@ -3090,51 +2568,7 @@
                 <w:szCs w:val="22"/>
                 <w:lang w:val="en-US"/>
               </w:rPr>
-              <w:t xml:space="preserve"> (this corresponds to columns starting with </w:t>
-            </w:r>
-            <w:proofErr w:type="spellStart"/>
-            <w:r>
-              <w:rPr>
-                <w:rFonts w:ascii="Calibri" w:hAnsi="Calibri" w:cs="Calibri"/>
-                <w:color w:val="000000"/>
-                <w:sz w:val="22"/>
-                <w:szCs w:val="22"/>
-                <w:lang w:val="en-US"/>
-              </w:rPr>
-              <w:t>ci_lower</w:t>
-            </w:r>
-            <w:proofErr w:type="spellEnd"/>
-            <w:r>
-              <w:rPr>
-                <w:rFonts w:ascii="Calibri" w:hAnsi="Calibri" w:cs="Calibri"/>
-                <w:color w:val="000000"/>
-                <w:sz w:val="22"/>
-                <w:szCs w:val="22"/>
-                <w:lang w:val="en-US"/>
-              </w:rPr>
-              <w:t xml:space="preserve"> and </w:t>
-            </w:r>
-            <w:proofErr w:type="spellStart"/>
-            <w:r>
-              <w:rPr>
-                <w:rFonts w:ascii="Calibri" w:hAnsi="Calibri" w:cs="Calibri"/>
-                <w:color w:val="000000"/>
-                <w:sz w:val="22"/>
-                <w:szCs w:val="22"/>
-                <w:lang w:val="en-US"/>
-              </w:rPr>
-              <w:t>ci_upper</w:t>
-            </w:r>
-            <w:proofErr w:type="spellEnd"/>
-            <w:r>
-              <w:rPr>
-                <w:rFonts w:ascii="Calibri" w:hAnsi="Calibri" w:cs="Calibri"/>
-                <w:color w:val="000000"/>
-                <w:sz w:val="22"/>
-                <w:szCs w:val="22"/>
-                <w:lang w:val="en-US"/>
-              </w:rPr>
-              <w:t>)</w:t>
+              <w:t xml:space="preserve"> (this corresponds to columns starting with ci_lower and ci_upper)</w:t>
             </w:r>
             <w:r>
               <w:rPr>
@@ -3244,35 +2678,7 @@
                 <w:rFonts w:ascii="Arial" w:hAnsi="Arial" w:cs="Arial"/>
                 <w:lang w:val="en-GB"/>
               </w:rPr>
-              <w:t xml:space="preserve">The csv file </w:t>
-            </w:r>
-            <w:r>
-              <w:rPr>
-                <w:rFonts w:ascii="Arial" w:hAnsi="Arial" w:cs="Arial"/>
-                <w:lang w:val="en-GB"/>
-              </w:rPr>
-              <w:t>subgroup</w:t>
-            </w:r>
-            <w:r>
-              <w:rPr>
-                <w:rFonts w:ascii="Arial" w:hAnsi="Arial" w:cs="Arial"/>
-                <w:lang w:val="en-GB"/>
-              </w:rPr>
-              <w:t xml:space="preserve">_investigation.csv seeks to answer the </w:t>
-            </w:r>
-            <w:r>
-              <w:rPr>
-                <w:rFonts w:ascii="Arial" w:hAnsi="Arial" w:cs="Arial"/>
-                <w:lang w:val="en-GB"/>
-              </w:rPr>
-              <w:t>second</w:t>
-            </w:r>
-            <w:r>
-              <w:rPr>
-                <w:rFonts w:ascii="Arial" w:hAnsi="Arial" w:cs="Arial"/>
-                <w:lang w:val="en-GB"/>
-              </w:rPr>
-              <w:t xml:space="preserve"> question mentioned above.</w:t>
+              <w:t>The csv file subgroup_investigation.csv seeks to answer the second question mentioned above.</w:t>
             </w:r>
           </w:p>
           <w:p>
@@ -3303,44 +2709,7 @@
                 <w:rFonts w:ascii="Arial" w:hAnsi="Arial" w:cs="Arial"/>
                 <w:lang w:val="en-GB"/>
               </w:rPr>
-              <w:t xml:space="preserve">Each row of the csv file corresponds to a default </w:t>
-            </w:r>
-            <w:proofErr w:type="spellStart"/>
-            <w:r>
-              <w:rPr>
-                <w:rFonts w:ascii="Arial" w:hAnsi="Arial" w:cs="Arial"/>
-                <w:lang w:val="en-GB"/>
-              </w:rPr>
-              <w:t>catboost</w:t>
-            </w:r>
-            <w:proofErr w:type="spellEnd"/>
-            <w:r>
-              <w:rPr>
-                <w:rFonts w:ascii="Arial" w:hAnsi="Arial" w:cs="Arial"/>
-                <w:lang w:val="en-GB"/>
-              </w:rPr>
-              <w:t xml:space="preserve"> model trained with a particular bundle of features</w:t>
-            </w:r>
-            <w:r>
-              <w:rPr>
-                <w:rFonts w:ascii="Arial" w:hAnsi="Arial" w:cs="Arial"/>
-                <w:lang w:val="en-GB"/>
-              </w:rPr>
-              <w:t xml:space="preserve"> and evaluated on</w:t>
-            </w:r>
-            <w:r>
-              <w:rPr>
-                <w:rFonts w:ascii="Arial" w:hAnsi="Arial" w:cs="Arial"/>
-                <w:lang w:val="en-GB"/>
-              </w:rPr>
-              <w:t xml:space="preserve"> a particular</w:t>
-            </w:r>
-            <w:r>
-              <w:rPr>
-                <w:rFonts w:ascii="Arial" w:hAnsi="Arial" w:cs="Arial"/>
-                <w:lang w:val="en-GB"/>
-              </w:rPr>
-              <w:t xml:space="preserve"> evaluation set. The models always use the maximum training set size of 3696041. It’s the same training set as mentioned earlier.</w:t>
+              <w:t>Each row of the csv file corresponds to a default catboost model trained with a particular bundle of features and evaluated on a particular evaluation set. The models always use the maximum training set size of 3696041. It’s the same training set as mentioned earlier.</w:t>
             </w:r>
           </w:p>
           <w:p>
@@ -3390,58 +2759,12 @@
                 <w:lang w:val="en-GB"/>
               </w:rPr>
             </w:pPr>
-            <w:proofErr w:type="spellStart"/>
-            <w:r>
-              <w:rPr>
-                <w:rFonts w:ascii="Arial" w:hAnsi="Arial" w:cs="Arial"/>
-                <w:lang w:val="en-GB"/>
-              </w:rPr>
-              <w:t>key_records</w:t>
-            </w:r>
-            <w:proofErr w:type="spellEnd"/>
-            <w:r>
-              <w:rPr>
-                <w:rFonts w:ascii="Arial" w:hAnsi="Arial" w:cs="Arial"/>
-                <w:lang w:val="en-GB"/>
-              </w:rPr>
-              <w:t>: It’s the same set of features as indicated by “</w:t>
-            </w:r>
-            <w:proofErr w:type="spellStart"/>
-            <w:r>
-              <w:rPr>
-                <w:rFonts w:ascii="Arial" w:hAnsi="Arial" w:cs="Arial"/>
-                <w:lang w:val="en-GB"/>
-              </w:rPr>
-              <w:t>key_records</w:t>
-            </w:r>
-            <w:proofErr w:type="spellEnd"/>
-            <w:r>
-              <w:rPr>
-                <w:rFonts w:ascii="Arial" w:hAnsi="Arial" w:cs="Arial"/>
-                <w:lang w:val="en-GB"/>
-              </w:rPr>
-              <w:t xml:space="preserve">” in the other csv file. It’s </w:t>
-            </w:r>
-            <w:r>
-              <w:rPr>
-                <w:rFonts w:ascii="Arial" w:hAnsi="Arial" w:cs="Arial"/>
-                <w:lang w:val="en-GB"/>
-              </w:rPr>
-              <w:t xml:space="preserve">GBAPERSOONTAB </w:t>
-            </w:r>
-            <w:r>
-              <w:rPr>
-                <w:rFonts w:ascii="Arial" w:hAnsi="Arial" w:cs="Arial"/>
-                <w:lang w:val="en-GB"/>
-              </w:rPr>
-              <w:t>plus</w:t>
-            </w:r>
-            <w:r>
-              <w:rPr>
-                <w:rFonts w:ascii="Arial" w:hAnsi="Arial" w:cs="Arial"/>
-                <w:lang w:val="en-GB"/>
-              </w:rPr>
-              <w:t xml:space="preserve"> </w:t>
+            <w:r>
+              <w:rPr>
+                <w:rFonts w:ascii="Arial" w:hAnsi="Arial" w:cs="Arial"/>
+                <w:lang w:val="en-GB"/>
+              </w:rPr>
+              <w:t xml:space="preserve">key_records: It’s the same set of features as indicated by “key_records” in the other csv file. It’s GBAPERSOONTAB plus </w:t>
             </w:r>
             <w:r>
               <w:rPr>
@@ -3480,49 +2803,15 @@
                 <w:lang w:val="en-GB"/>
               </w:rPr>
             </w:pPr>
-            <w:proofErr w:type="spellStart"/>
-            <w:r>
-              <w:rPr>
-                <w:rFonts w:ascii="Calibri" w:hAnsi="Calibri" w:cs="Calibri"/>
-                <w:color w:val="000000"/>
-                <w:sz w:val="22"/>
-                <w:szCs w:val="22"/>
-                <w:lang w:val="en-US"/>
-              </w:rPr>
-              <w:t>augmented_records</w:t>
-            </w:r>
-            <w:proofErr w:type="spellEnd"/>
-            <w:r>
-              <w:rPr>
-                <w:rFonts w:ascii="Calibri" w:hAnsi="Calibri" w:cs="Calibri"/>
-                <w:color w:val="000000"/>
-                <w:sz w:val="22"/>
-                <w:szCs w:val="22"/>
-                <w:lang w:val="en-US"/>
-              </w:rPr>
-              <w:t>: “</w:t>
-            </w:r>
-            <w:proofErr w:type="spellStart"/>
-            <w:r>
-              <w:rPr>
-                <w:rFonts w:ascii="Calibri" w:hAnsi="Calibri" w:cs="Calibri"/>
-                <w:color w:val="000000"/>
-                <w:sz w:val="22"/>
-                <w:szCs w:val="22"/>
-                <w:lang w:val="en-US"/>
-              </w:rPr>
-              <w:t>augmented_records</w:t>
-            </w:r>
-            <w:proofErr w:type="spellEnd"/>
-            <w:r>
-              <w:rPr>
-                <w:rFonts w:ascii="Calibri" w:hAnsi="Calibri" w:cs="Calibri"/>
-                <w:color w:val="000000"/>
-                <w:sz w:val="22"/>
-                <w:szCs w:val="22"/>
-                <w:lang w:val="en-US"/>
-              </w:rPr>
-              <w:t>” is also defined identically across the two csv files.</w:t>
+            <w:r>
+              <w:rPr>
+                <w:rFonts w:ascii="Calibri" w:hAnsi="Calibri" w:cs="Calibri"/>
+                <w:color w:val="000000"/>
+                <w:sz w:val="22"/>
+                <w:szCs w:val="22"/>
+                <w:lang w:val="en-US"/>
+              </w:rPr>
+              <w:t>augmented_records: “augmented_records” is also defined identically across the two csv files.</w:t>
             </w:r>
           </w:p>
           <w:p>
@@ -3553,23 +2842,7 @@
                 <w:rFonts w:ascii="Arial" w:hAnsi="Arial" w:cs="Arial"/>
                 <w:lang w:val="en-GB"/>
               </w:rPr>
-              <w:t xml:space="preserve">There are 16 options for </w:t>
-            </w:r>
-            <w:proofErr w:type="spellStart"/>
-            <w:r>
-              <w:rPr>
-                <w:rFonts w:ascii="Arial" w:hAnsi="Arial" w:cs="Arial"/>
-                <w:lang w:val="en-GB"/>
-              </w:rPr>
-              <w:t>evaluation_set</w:t>
-            </w:r>
-            <w:proofErr w:type="spellEnd"/>
-            <w:r>
-              <w:rPr>
-                <w:rFonts w:ascii="Arial" w:hAnsi="Arial" w:cs="Arial"/>
-                <w:lang w:val="en-GB"/>
-              </w:rPr>
-              <w:t>:</w:t>
+              <w:t>There are 16 options for evaluation_set:</w:t>
             </w:r>
           </w:p>
           <w:p>
@@ -3668,30 +2941,7 @@
                 <w:rFonts w:ascii="Arial" w:hAnsi="Arial" w:cs="Arial"/>
                 <w:lang w:val="en-GB"/>
               </w:rPr>
-              <w:t>GBAPERSOONTAB</w:t>
-            </w:r>
-            <w:r>
-              <w:rPr>
-                <w:rFonts w:ascii="Arial" w:hAnsi="Arial" w:cs="Arial"/>
-                <w:lang w:val="en-GB"/>
-              </w:rPr>
-              <w:t xml:space="preserve">. One set contains all men in the evaluation set curated by Lisa </w:t>
-            </w:r>
-            <w:proofErr w:type="spellStart"/>
-            <w:r>
-              <w:rPr>
-                <w:rFonts w:ascii="Arial" w:hAnsi="Arial" w:cs="Arial"/>
-                <w:lang w:val="en-GB"/>
-              </w:rPr>
-              <w:t>Sivak</w:t>
-            </w:r>
-            <w:proofErr w:type="spellEnd"/>
-            <w:r>
-              <w:rPr>
-                <w:rFonts w:ascii="Arial" w:hAnsi="Arial" w:cs="Arial"/>
-                <w:lang w:val="en-GB"/>
-              </w:rPr>
-              <w:t>, the other contains all women.</w:t>
+              <w:t>GBAPERSOONTAB. One set contains all men in the evaluation set curated by Lisa Sivak, the other contains all women.</w:t>
             </w:r>
           </w:p>
           <w:p>
@@ -3732,21 +2982,7 @@
                 <w:rFonts w:ascii="Arial" w:hAnsi="Arial" w:cs="Arial"/>
                 <w:lang w:val="en-GB"/>
               </w:rPr>
-              <w:t xml:space="preserve"> from </w:t>
-            </w:r>
-            <w:r>
-              <w:rPr>
-                <w:rFonts w:ascii="Arial" w:hAnsi="Arial" w:cs="Arial"/>
-                <w:lang w:val="en-GB"/>
-              </w:rPr>
-              <w:t>GBAPERSOONTAB</w:t>
-            </w:r>
-            <w:r>
-              <w:rPr>
-                <w:rFonts w:ascii="Arial" w:hAnsi="Arial" w:cs="Arial"/>
-                <w:lang w:val="en-GB"/>
-              </w:rPr>
-              <w:t xml:space="preserve">. There are seven </w:t>
+              <w:t xml:space="preserve"> from GBAPERSOONTAB. There are seven </w:t>
             </w:r>
             <w:r>
               <w:rPr>
@@ -3823,23 +3059,7 @@
                 <w:rFonts w:ascii="Arial" w:hAnsi="Arial" w:cs="Arial"/>
                 <w:lang w:val="en-GB"/>
               </w:rPr>
-              <w:t xml:space="preserve">. Lisa </w:t>
-            </w:r>
-            <w:proofErr w:type="spellStart"/>
-            <w:r>
-              <w:rPr>
-                <w:rFonts w:ascii="Arial" w:hAnsi="Arial" w:cs="Arial"/>
-                <w:lang w:val="en-GB"/>
-              </w:rPr>
-              <w:t>Sivak</w:t>
-            </w:r>
-            <w:proofErr w:type="spellEnd"/>
-            <w:r>
-              <w:rPr>
-                <w:rFonts w:ascii="Arial" w:hAnsi="Arial" w:cs="Arial"/>
-                <w:lang w:val="en-GB"/>
-              </w:rPr>
-              <w:t xml:space="preserve"> constructed this variable using information from </w:t>
+              <w:t xml:space="preserve">. Lisa Sivak constructed this variable using information from </w:t>
             </w:r>
             <w:r>
               <w:rPr>
@@ -3886,29 +3106,7 @@
                 <w:szCs w:val="22"/>
                 <w:lang w:val="en-GB"/>
               </w:rPr>
-              <w:t xml:space="preserve">As indicated by the </w:t>
-            </w:r>
-            <w:proofErr w:type="spellStart"/>
-            <w:r>
-              <w:rPr>
-                <w:rFonts w:ascii="Calibri" w:hAnsi="Calibri" w:cs="Calibri"/>
-                <w:color w:val="000000"/>
-                <w:sz w:val="22"/>
-                <w:szCs w:val="22"/>
-                <w:lang w:val="en-GB"/>
-              </w:rPr>
-              <w:t>n_evaluation_set</w:t>
-            </w:r>
-            <w:proofErr w:type="spellEnd"/>
-            <w:r>
-              <w:rPr>
-                <w:rFonts w:ascii="Calibri" w:hAnsi="Calibri" w:cs="Calibri"/>
-                <w:color w:val="000000"/>
-                <w:sz w:val="22"/>
-                <w:szCs w:val="22"/>
-                <w:lang w:val="en-GB"/>
-              </w:rPr>
-              <w:t xml:space="preserve"> column, each of the evaluation sets have at least 1501 individuals.</w:t>
+              <w:t>As indicated by the n_evaluation_set column, each of the evaluation sets have at least 1501 individuals.</w:t>
             </w:r>
           </w:p>
           <w:p>
@@ -3950,29 +3148,7 @@
                 <w:szCs w:val="22"/>
                 <w:lang w:val="en-GB"/>
               </w:rPr>
-              <w:t xml:space="preserve">We calculate the following prediction metrics: </w:t>
-            </w:r>
-            <w:proofErr w:type="spellStart"/>
-            <w:r>
-              <w:rPr>
-                <w:rFonts w:ascii="Calibri" w:hAnsi="Calibri" w:cs="Calibri"/>
-                <w:color w:val="000000"/>
-                <w:sz w:val="22"/>
-                <w:szCs w:val="22"/>
-                <w:lang w:val="en-GB"/>
-              </w:rPr>
-              <w:t>LogLoss</w:t>
-            </w:r>
-            <w:proofErr w:type="spellEnd"/>
-            <w:r>
-              <w:rPr>
-                <w:rFonts w:ascii="Calibri" w:hAnsi="Calibri" w:cs="Calibri"/>
-                <w:color w:val="000000"/>
-                <w:sz w:val="22"/>
-                <w:szCs w:val="22"/>
-                <w:lang w:val="en-GB"/>
-              </w:rPr>
-              <w:t>, MSE, R2_Score, F1_Score (with threshold), as well as the area under the receiver operating characteristics curve (AUC).</w:t>
+              <w:t>We calculate the following prediction metrics: LogLoss, MSE, R2_Score, F1_Score (with threshold), as well as the area under the receiver operating characteristics curve (AUC).</w:t>
             </w:r>
             <w:r>
               <w:rPr>
@@ -3984,8 +3160,6 @@
               </w:rPr>
               <w:t xml:space="preserve"> Again, t</w:t>
             </w:r>
-            <w:bookmarkStart w:id="0" w:name="_GoBack"/>
-            <w:bookmarkEnd w:id="0"/>
             <w:r>
               <w:rPr>
                 <w:rFonts w:ascii="Calibri" w:hAnsi="Calibri" w:cs="Calibri"/>
@@ -4062,7 +3236,6 @@
               <w:bottom w:val="single" w:sz="4" w:space="0" w:color="auto"/>
               <w:right w:val="single" w:sz="4" w:space="0" w:color="auto"/>
             </w:tcBorders>
-            <w:shd w:val="clear" w:color="auto" w:fill="auto"/>
           </w:tcPr>
           <w:p>
             <w:pPr>
@@ -4097,7 +3270,6 @@
               <w:bottom w:val="single" w:sz="4" w:space="0" w:color="auto"/>
               <w:right w:val="single" w:sz="4" w:space="0" w:color="auto"/>
             </w:tcBorders>
-            <w:shd w:val="clear" w:color="auto" w:fill="auto"/>
           </w:tcPr>
           <w:p>
             <w:pPr>
@@ -4126,7 +3298,6 @@
               <w:bottom w:val="single" w:sz="4" w:space="0" w:color="auto"/>
               <w:right w:val="single" w:sz="4" w:space="0" w:color="auto"/>
             </w:tcBorders>
-            <w:shd w:val="clear" w:color="auto" w:fill="auto"/>
           </w:tcPr>
           <w:p>
             <w:pPr>
@@ -4181,7 +3352,6 @@
               <w:bottom w:val="single" w:sz="4" w:space="0" w:color="auto"/>
               <w:right w:val="single" w:sz="4" w:space="0" w:color="auto"/>
             </w:tcBorders>
-            <w:shd w:val="clear" w:color="auto" w:fill="auto"/>
           </w:tcPr>
           <w:p>
             <w:pPr>
@@ -4210,7 +3380,6 @@
               <w:bottom w:val="single" w:sz="4" w:space="0" w:color="auto"/>
               <w:right w:val="single" w:sz="4" w:space="0" w:color="auto"/>
             </w:tcBorders>
-            <w:shd w:val="clear" w:color="auto" w:fill="auto"/>
           </w:tcPr>
           <w:p>
             <w:pPr>
@@ -4244,7 +3413,6 @@
               <w:bottom w:val="single" w:sz="4" w:space="0" w:color="auto"/>
               <w:right w:val="single" w:sz="4" w:space="0" w:color="auto"/>
             </w:tcBorders>
-            <w:shd w:val="clear" w:color="auto" w:fill="auto"/>
           </w:tcPr>
           <w:p>
             <w:pPr>
@@ -4273,7 +3441,6 @@
               <w:bottom w:val="single" w:sz="4" w:space="0" w:color="auto"/>
               <w:right w:val="single" w:sz="4" w:space="0" w:color="auto"/>
             </w:tcBorders>
-            <w:shd w:val="clear" w:color="auto" w:fill="auto"/>
           </w:tcPr>
           <w:p>
             <w:pPr>
@@ -4308,23 +3475,7 @@
                 <w:rFonts w:ascii="Arial" w:hAnsi="Arial" w:cs="Arial"/>
                 <w:lang w:val="en-GB"/>
               </w:rPr>
-              <w:t>Does this output contain information on 1 institution/company/household/</w:t>
-            </w:r>
-            <w:proofErr w:type="spellStart"/>
-            <w:r>
-              <w:rPr>
-                <w:rFonts w:ascii="Arial" w:hAnsi="Arial" w:cs="Arial"/>
-                <w:lang w:val="en-GB"/>
-              </w:rPr>
-              <w:t>etc</w:t>
-            </w:r>
-            <w:proofErr w:type="spellEnd"/>
-            <w:r>
-              <w:rPr>
-                <w:rFonts w:ascii="Arial" w:hAnsi="Arial" w:cs="Arial"/>
-                <w:lang w:val="en-GB"/>
-              </w:rPr>
-              <w:t>?</w:t>
+              <w:t>Does this output contain information on 1 institution/company/household/etc?</w:t>
             </w:r>
             <w:r>
               <w:rPr>
@@ -4344,7 +3495,6 @@
               <w:bottom w:val="single" w:sz="4" w:space="0" w:color="auto"/>
               <w:right w:val="single" w:sz="4" w:space="0" w:color="auto"/>
             </w:tcBorders>
-            <w:shd w:val="clear" w:color="auto" w:fill="auto"/>
           </w:tcPr>
           <w:p>
             <w:pPr>
@@ -4373,7 +3523,6 @@
               <w:bottom w:val="single" w:sz="4" w:space="0" w:color="auto"/>
               <w:right w:val="single" w:sz="4" w:space="0" w:color="auto"/>
             </w:tcBorders>
-            <w:shd w:val="clear" w:color="auto" w:fill="auto"/>
           </w:tcPr>
           <w:p>
             <w:pPr>
@@ -4438,7 +3587,6 @@
               <w:bottom w:val="single" w:sz="4" w:space="0" w:color="auto"/>
               <w:right w:val="single" w:sz="4" w:space="0" w:color="auto"/>
             </w:tcBorders>
-            <w:shd w:val="clear" w:color="auto" w:fill="auto"/>
           </w:tcPr>
           <w:p>
             <w:pPr>
@@ -4467,7 +3615,6 @@
               <w:bottom w:val="single" w:sz="4" w:space="0" w:color="auto"/>
               <w:right w:val="single" w:sz="4" w:space="0" w:color="auto"/>
             </w:tcBorders>
-            <w:shd w:val="clear" w:color="auto" w:fill="auto"/>
           </w:tcPr>
           <w:p>
             <w:pPr>
@@ -4501,7 +3648,6 @@
               <w:bottom w:val="single" w:sz="4" w:space="0" w:color="auto"/>
               <w:right w:val="single" w:sz="4" w:space="0" w:color="auto"/>
             </w:tcBorders>
-            <w:shd w:val="clear" w:color="auto" w:fill="auto"/>
           </w:tcPr>
           <w:p>
             <w:pPr>
@@ -4536,7 +3682,7 @@
 </file>
 
 <file path=word/endnotes.xml><?xml version="1.0" encoding="utf-8"?>
-<w:endnotes xmlns:wpc="http://schemas.microsoft.com/office/word/2010/wordprocessingCanvas" xmlns:cx="http://schemas.microsoft.com/office/drawing/2014/chartex" xmlns:cx1="http://schemas.microsoft.com/office/drawing/2015/9/8/chartex" xmlns:mc="http://schemas.openxmlformats.org/markup-compatibility/2006" xmlns:o="urn:schemas-microsoft-com:office:office" xmlns:r="http://schemas.openxmlformats.org/officeDocument/2006/relationships" xmlns:m="http://schemas.openxmlformats.org/officeDocument/2006/math" xmlns:v="urn:schemas-microsoft-com:vml" xmlns:wp14="http://schemas.microsoft.com/office/word/2010/wordprocessingDrawing" xmlns:wp="http://schemas.openxmlformats.org/drawingml/2006/wordprocessingDrawing" xmlns:w10="urn:schemas-microsoft-com:office:word" xmlns:w="http://schemas.openxmlformats.org/wordprocessingml/2006/main" xmlns:w14="http://schemas.microsoft.com/office/word/2010/wordml" xmlns:w15="http://schemas.microsoft.com/office/word/2012/wordml" xmlns:w16se="http://schemas.microsoft.com/office/word/2015/wordml/symex" xmlns:wpg="http://schemas.microsoft.com/office/word/2010/wordprocessingGroup" xmlns:wpi="http://schemas.microsoft.com/office/word/2010/wordprocessingInk" xmlns:wne="http://schemas.microsoft.com/office/word/2006/wordml" xmlns:wps="http://schemas.microsoft.com/office/word/2010/wordprocessingShape" mc:Ignorable="w14 w15 w16se wp14">
+<w:endnotes xmlns:wpc="http://schemas.microsoft.com/office/word/2010/wordprocessingCanvas" xmlns:cx="http://schemas.microsoft.com/office/drawing/2014/chartex" xmlns:cx1="http://schemas.microsoft.com/office/drawing/2015/9/8/chartex" xmlns:cx2="http://schemas.microsoft.com/office/drawing/2015/10/21/chartex" xmlns:cx3="http://schemas.microsoft.com/office/drawing/2016/5/9/chartex" xmlns:cx4="http://schemas.microsoft.com/office/drawing/2016/5/10/chartex" xmlns:cx5="http://schemas.microsoft.com/office/drawing/2016/5/11/chartex" xmlns:cx6="http://schemas.microsoft.com/office/drawing/2016/5/12/chartex" xmlns:cx7="http://schemas.microsoft.com/office/drawing/2016/5/13/chartex" xmlns:cx8="http://schemas.microsoft.com/office/drawing/2016/5/14/chartex" xmlns:mc="http://schemas.openxmlformats.org/markup-compatibility/2006" xmlns:aink="http://schemas.microsoft.com/office/drawing/2016/ink" xmlns:am3d="http://schemas.microsoft.com/office/drawing/2017/model3d" xmlns:o="urn:schemas-microsoft-com:office:office" xmlns:oel="http://schemas.microsoft.com/office/2019/extlst" xmlns:r="http://schemas.openxmlformats.org/officeDocument/2006/relationships" xmlns:m="http://schemas.openxmlformats.org/officeDocument/2006/math" xmlns:v="urn:schemas-microsoft-com:vml" xmlns:wp14="http://schemas.microsoft.com/office/word/2010/wordprocessingDrawing" xmlns:wp="http://schemas.openxmlformats.org/drawingml/2006/wordprocessingDrawing" xmlns:w10="urn:schemas-microsoft-com:office:word" xmlns:w="http://schemas.openxmlformats.org/wordprocessingml/2006/main" xmlns:w14="http://schemas.microsoft.com/office/word/2010/wordml" xmlns:w15="http://schemas.microsoft.com/office/word/2012/wordml" xmlns:w16cex="http://schemas.microsoft.com/office/word/2018/wordml/cex" xmlns:w16cid="http://schemas.microsoft.com/office/word/2016/wordml/cid" xmlns:w16="http://schemas.microsoft.com/office/word/2018/wordml" xmlns:w16du="http://schemas.microsoft.com/office/word/2023/wordml/word16du" xmlns:w16sdtdh="http://schemas.microsoft.com/office/word/2020/wordml/sdtdatahash" xmlns:w16sdtfl="http://schemas.microsoft.com/office/word/2024/wordml/sdtformatlock" xmlns:w16se="http://schemas.microsoft.com/office/word/2015/wordml/symex" xmlns:wpg="http://schemas.microsoft.com/office/word/2010/wordprocessingGroup" xmlns:wpi="http://schemas.microsoft.com/office/word/2010/wordprocessingInk" xmlns:wne="http://schemas.microsoft.com/office/word/2006/wordml" xmlns:wps="http://schemas.microsoft.com/office/word/2010/wordprocessingShape" mc:Ignorable="w14 w15 w16se w16cid w16 w16cex w16sdtdh w16sdtfl w16du wp14">
   <w:endnote w:type="separator" w:id="-1">
     <w:p>
       <w:r>
@@ -4555,7 +3701,7 @@
 </file>
 
 <file path=word/footer1.xml><?xml version="1.0" encoding="utf-8"?>
-<w:ftr xmlns:wpc="http://schemas.microsoft.com/office/word/2010/wordprocessingCanvas" xmlns:cx="http://schemas.microsoft.com/office/drawing/2014/chartex" xmlns:cx1="http://schemas.microsoft.com/office/drawing/2015/9/8/chartex" xmlns:mc="http://schemas.openxmlformats.org/markup-compatibility/2006" xmlns:o="urn:schemas-microsoft-com:office:office" xmlns:r="http://schemas.openxmlformats.org/officeDocument/2006/relationships" xmlns:m="http://schemas.openxmlformats.org/officeDocument/2006/math" xmlns:v="urn:schemas-microsoft-com:vml" xmlns:wp14="http://schemas.microsoft.com/office/word/2010/wordprocessingDrawing" xmlns:wp="http://schemas.openxmlformats.org/drawingml/2006/wordprocessingDrawing" xmlns:w10="urn:schemas-microsoft-com:office:word" xmlns:w="http://schemas.openxmlformats.org/wordprocessingml/2006/main" xmlns:w14="http://schemas.microsoft.com/office/word/2010/wordml" xmlns:w15="http://schemas.microsoft.com/office/word/2012/wordml" xmlns:w16se="http://schemas.microsoft.com/office/word/2015/wordml/symex" xmlns:wpg="http://schemas.microsoft.com/office/word/2010/wordprocessingGroup" xmlns:wpi="http://schemas.microsoft.com/office/word/2010/wordprocessingInk" xmlns:wne="http://schemas.microsoft.com/office/word/2006/wordml" xmlns:wps="http://schemas.microsoft.com/office/word/2010/wordprocessingShape" mc:Ignorable="w14 w15 w16se wp14">
+<w:ftr xmlns:wpc="http://schemas.microsoft.com/office/word/2010/wordprocessingCanvas" xmlns:cx="http://schemas.microsoft.com/office/drawing/2014/chartex" xmlns:cx1="http://schemas.microsoft.com/office/drawing/2015/9/8/chartex" xmlns:cx2="http://schemas.microsoft.com/office/drawing/2015/10/21/chartex" xmlns:cx3="http://schemas.microsoft.com/office/drawing/2016/5/9/chartex" xmlns:cx4="http://schemas.microsoft.com/office/drawing/2016/5/10/chartex" xmlns:cx5="http://schemas.microsoft.com/office/drawing/2016/5/11/chartex" xmlns:cx6="http://schemas.microsoft.com/office/drawing/2016/5/12/chartex" xmlns:cx7="http://schemas.microsoft.com/office/drawing/2016/5/13/chartex" xmlns:cx8="http://schemas.microsoft.com/office/drawing/2016/5/14/chartex" xmlns:mc="http://schemas.openxmlformats.org/markup-compatibility/2006" xmlns:aink="http://schemas.microsoft.com/office/drawing/2016/ink" xmlns:am3d="http://schemas.microsoft.com/office/drawing/2017/model3d" xmlns:o="urn:schemas-microsoft-com:office:office" xmlns:oel="http://schemas.microsoft.com/office/2019/extlst" xmlns:r="http://schemas.openxmlformats.org/officeDocument/2006/relationships" xmlns:m="http://schemas.openxmlformats.org/officeDocument/2006/math" xmlns:v="urn:schemas-microsoft-com:vml" xmlns:wp14="http://schemas.microsoft.com/office/word/2010/wordprocessingDrawing" xmlns:wp="http://schemas.openxmlformats.org/drawingml/2006/wordprocessingDrawing" xmlns:w10="urn:schemas-microsoft-com:office:word" xmlns:w="http://schemas.openxmlformats.org/wordprocessingml/2006/main" xmlns:w14="http://schemas.microsoft.com/office/word/2010/wordml" xmlns:w15="http://schemas.microsoft.com/office/word/2012/wordml" xmlns:w16cex="http://schemas.microsoft.com/office/word/2018/wordml/cex" xmlns:w16cid="http://schemas.microsoft.com/office/word/2016/wordml/cid" xmlns:w16="http://schemas.microsoft.com/office/word/2018/wordml" xmlns:w16du="http://schemas.microsoft.com/office/word/2023/wordml/word16du" xmlns:w16sdtdh="http://schemas.microsoft.com/office/word/2020/wordml/sdtdatahash" xmlns:w16sdtfl="http://schemas.microsoft.com/office/word/2024/wordml/sdtformatlock" xmlns:w16se="http://schemas.microsoft.com/office/word/2015/wordml/symex" xmlns:wpg="http://schemas.microsoft.com/office/word/2010/wordprocessingGroup" xmlns:wpi="http://schemas.microsoft.com/office/word/2010/wordprocessingInk" xmlns:wne="http://schemas.microsoft.com/office/word/2006/wordml" xmlns:wps="http://schemas.microsoft.com/office/word/2010/wordprocessingShape" mc:Ignorable="w14 w15 w16se w16cid w16 w16cex w16sdtdh w16sdtfl w16du wp14">
   <w:p>
     <w:pPr>
       <w:pStyle w:val="Footer"/>
@@ -4586,7 +3732,7 @@
 </file>
 
 <file path=word/footnotes.xml><?xml version="1.0" encoding="utf-8"?>
-<w:footnotes xmlns:wpc="http://schemas.microsoft.com/office/word/2010/wordprocessingCanvas" xmlns:cx="http://schemas.microsoft.com/office/drawing/2014/chartex" xmlns:cx1="http://schemas.microsoft.com/office/drawing/2015/9/8/chartex" xmlns:mc="http://schemas.openxmlformats.org/markup-compatibility/2006" xmlns:o="urn:schemas-microsoft-com:office:office" xmlns:r="http://schemas.openxmlformats.org/officeDocument/2006/relationships" xmlns:m="http://schemas.openxmlformats.org/officeDocument/2006/math" xmlns:v="urn:schemas-microsoft-com:vml" xmlns:wp14="http://schemas.microsoft.com/office/word/2010/wordprocessingDrawing" xmlns:wp="http://schemas.openxmlformats.org/drawingml/2006/wordprocessingDrawing" xmlns:w10="urn:schemas-microsoft-com:office:word" xmlns:w="http://schemas.openxmlformats.org/wordprocessingml/2006/main" xmlns:w14="http://schemas.microsoft.com/office/word/2010/wordml" xmlns:w15="http://schemas.microsoft.com/office/word/2012/wordml" xmlns:w16se="http://schemas.microsoft.com/office/word/2015/wordml/symex" xmlns:wpg="http://schemas.microsoft.com/office/word/2010/wordprocessingGroup" xmlns:wpi="http://schemas.microsoft.com/office/word/2010/wordprocessingInk" xmlns:wne="http://schemas.microsoft.com/office/word/2006/wordml" xmlns:wps="http://schemas.microsoft.com/office/word/2010/wordprocessingShape" mc:Ignorable="w14 w15 w16se wp14">
+<w:footnotes xmlns:wpc="http://schemas.microsoft.com/office/word/2010/wordprocessingCanvas" xmlns:cx="http://schemas.microsoft.com/office/drawing/2014/chartex" xmlns:cx1="http://schemas.microsoft.com/office/drawing/2015/9/8/chartex" xmlns:cx2="http://schemas.microsoft.com/office/drawing/2015/10/21/chartex" xmlns:cx3="http://schemas.microsoft.com/office/drawing/2016/5/9/chartex" xmlns:cx4="http://schemas.microsoft.com/office/drawing/2016/5/10/chartex" xmlns:cx5="http://schemas.microsoft.com/office/drawing/2016/5/11/chartex" xmlns:cx6="http://schemas.microsoft.com/office/drawing/2016/5/12/chartex" xmlns:cx7="http://schemas.microsoft.com/office/drawing/2016/5/13/chartex" xmlns:cx8="http://schemas.microsoft.com/office/drawing/2016/5/14/chartex" xmlns:mc="http://schemas.openxmlformats.org/markup-compatibility/2006" xmlns:aink="http://schemas.microsoft.com/office/drawing/2016/ink" xmlns:am3d="http://schemas.microsoft.com/office/drawing/2017/model3d" xmlns:o="urn:schemas-microsoft-com:office:office" xmlns:oel="http://schemas.microsoft.com/office/2019/extlst" xmlns:r="http://schemas.openxmlformats.org/officeDocument/2006/relationships" xmlns:m="http://schemas.openxmlformats.org/officeDocument/2006/math" xmlns:v="urn:schemas-microsoft-com:vml" xmlns:wp14="http://schemas.microsoft.com/office/word/2010/wordprocessingDrawing" xmlns:wp="http://schemas.openxmlformats.org/drawingml/2006/wordprocessingDrawing" xmlns:w10="urn:schemas-microsoft-com:office:word" xmlns:w="http://schemas.openxmlformats.org/wordprocessingml/2006/main" xmlns:w14="http://schemas.microsoft.com/office/word/2010/wordml" xmlns:w15="http://schemas.microsoft.com/office/word/2012/wordml" xmlns:w16cex="http://schemas.microsoft.com/office/word/2018/wordml/cex" xmlns:w16cid="http://schemas.microsoft.com/office/word/2016/wordml/cid" xmlns:w16="http://schemas.microsoft.com/office/word/2018/wordml" xmlns:w16du="http://schemas.microsoft.com/office/word/2023/wordml/word16du" xmlns:w16sdtdh="http://schemas.microsoft.com/office/word/2020/wordml/sdtdatahash" xmlns:w16sdtfl="http://schemas.microsoft.com/office/word/2024/wordml/sdtformatlock" xmlns:w16se="http://schemas.microsoft.com/office/word/2015/wordml/symex" xmlns:wpg="http://schemas.microsoft.com/office/word/2010/wordprocessingGroup" xmlns:wpi="http://schemas.microsoft.com/office/word/2010/wordprocessingInk" xmlns:wne="http://schemas.microsoft.com/office/word/2006/wordml" xmlns:wps="http://schemas.microsoft.com/office/word/2010/wordprocessingShape" mc:Ignorable="w14 w15 w16se w16cid w16 w16cex w16sdtdh w16sdtfl w16du wp14">
   <w:footnote w:type="separator" w:id="-1">
     <w:p>
       <w:r>
@@ -4697,7 +3843,7 @@
 </file>
 
 <file path=word/header1.xml><?xml version="1.0" encoding="utf-8"?>
-<w:hdr xmlns:wpc="http://schemas.microsoft.com/office/word/2010/wordprocessingCanvas" xmlns:cx="http://schemas.microsoft.com/office/drawing/2014/chartex" xmlns:cx1="http://schemas.microsoft.com/office/drawing/2015/9/8/chartex" xmlns:mc="http://schemas.openxmlformats.org/markup-compatibility/2006" xmlns:o="urn:schemas-microsoft-com:office:office" xmlns:r="http://schemas.openxmlformats.org/officeDocument/2006/relationships" xmlns:m="http://schemas.openxmlformats.org/officeDocument/2006/math" xmlns:v="urn:schemas-microsoft-com:vml" xmlns:wp14="http://schemas.microsoft.com/office/word/2010/wordprocessingDrawing" xmlns:wp="http://schemas.openxmlformats.org/drawingml/2006/wordprocessingDrawing" xmlns:w10="urn:schemas-microsoft-com:office:word" xmlns:w="http://schemas.openxmlformats.org/wordprocessingml/2006/main" xmlns:w14="http://schemas.microsoft.com/office/word/2010/wordml" xmlns:w15="http://schemas.microsoft.com/office/word/2012/wordml" xmlns:w16se="http://schemas.microsoft.com/office/word/2015/wordml/symex" xmlns:wpg="http://schemas.microsoft.com/office/word/2010/wordprocessingGroup" xmlns:wpi="http://schemas.microsoft.com/office/word/2010/wordprocessingInk" xmlns:wne="http://schemas.microsoft.com/office/word/2006/wordml" xmlns:wps="http://schemas.microsoft.com/office/word/2010/wordprocessingShape" mc:Ignorable="w14 w15 w16se wp14">
+<w:hdr xmlns:wpc="http://schemas.microsoft.com/office/word/2010/wordprocessingCanvas" xmlns:cx="http://schemas.microsoft.com/office/drawing/2014/chartex" xmlns:cx1="http://schemas.microsoft.com/office/drawing/2015/9/8/chartex" xmlns:cx2="http://schemas.microsoft.com/office/drawing/2015/10/21/chartex" xmlns:cx3="http://schemas.microsoft.com/office/drawing/2016/5/9/chartex" xmlns:cx4="http://schemas.microsoft.com/office/drawing/2016/5/10/chartex" xmlns:cx5="http://schemas.microsoft.com/office/drawing/2016/5/11/chartex" xmlns:cx6="http://schemas.microsoft.com/office/drawing/2016/5/12/chartex" xmlns:cx7="http://schemas.microsoft.com/office/drawing/2016/5/13/chartex" xmlns:cx8="http://schemas.microsoft.com/office/drawing/2016/5/14/chartex" xmlns:mc="http://schemas.openxmlformats.org/markup-compatibility/2006" xmlns:aink="http://schemas.microsoft.com/office/drawing/2016/ink" xmlns:am3d="http://schemas.microsoft.com/office/drawing/2017/model3d" xmlns:o="urn:schemas-microsoft-com:office:office" xmlns:oel="http://schemas.microsoft.com/office/2019/extlst" xmlns:r="http://schemas.openxmlformats.org/officeDocument/2006/relationships" xmlns:m="http://schemas.openxmlformats.org/officeDocument/2006/math" xmlns:v="urn:schemas-microsoft-com:vml" xmlns:wp14="http://schemas.microsoft.com/office/word/2010/wordprocessingDrawing" xmlns:wp="http://schemas.openxmlformats.org/drawingml/2006/wordprocessingDrawing" xmlns:w10="urn:schemas-microsoft-com:office:word" xmlns:w="http://schemas.openxmlformats.org/wordprocessingml/2006/main" xmlns:w14="http://schemas.microsoft.com/office/word/2010/wordml" xmlns:w15="http://schemas.microsoft.com/office/word/2012/wordml" xmlns:w16cex="http://schemas.microsoft.com/office/word/2018/wordml/cex" xmlns:w16cid="http://schemas.microsoft.com/office/word/2016/wordml/cid" xmlns:w16="http://schemas.microsoft.com/office/word/2018/wordml" xmlns:w16du="http://schemas.microsoft.com/office/word/2023/wordml/word16du" xmlns:w16sdtdh="http://schemas.microsoft.com/office/word/2020/wordml/sdtdatahash" xmlns:w16sdtfl="http://schemas.microsoft.com/office/word/2024/wordml/sdtformatlock" xmlns:w16se="http://schemas.microsoft.com/office/word/2015/wordml/symex" xmlns:wpg="http://schemas.microsoft.com/office/word/2010/wordprocessingGroup" xmlns:wpi="http://schemas.microsoft.com/office/word/2010/wordprocessingInk" xmlns:wne="http://schemas.microsoft.com/office/word/2006/wordml" xmlns:wps="http://schemas.microsoft.com/office/word/2010/wordprocessingShape" mc:Ignorable="w14 w15 w16se w16cid w16 w16cex w16sdtdh w16sdtfl w16du wp14">
   <w:p>
     <w:pPr>
       <w:pStyle w:val="Divisie"/>
@@ -4920,7 +4066,7 @@
 </file>
 
 <file path=word/numbering.xml><?xml version="1.0" encoding="utf-8"?>
-<w:numbering xmlns:wpc="http://schemas.microsoft.com/office/word/2010/wordprocessingCanvas" xmlns:cx="http://schemas.microsoft.com/office/drawing/2014/chartex" xmlns:cx1="http://schemas.microsoft.com/office/drawing/2015/9/8/chartex" xmlns:mc="http://schemas.openxmlformats.org/markup-compatibility/2006" xmlns:o="urn:schemas-microsoft-com:office:office" xmlns:r="http://schemas.openxmlformats.org/officeDocument/2006/relationships" xmlns:m="http://schemas.openxmlformats.org/officeDocument/2006/math" xmlns:v="urn:schemas-microsoft-com:vml" xmlns:wp14="http://schemas.microsoft.com/office/word/2010/wordprocessingDrawing" xmlns:wp="http://schemas.openxmlformats.org/drawingml/2006/wordprocessingDrawing" xmlns:w10="urn:schemas-microsoft-com:office:word" xmlns:w="http://schemas.openxmlformats.org/wordprocessingml/2006/main" xmlns:w14="http://schemas.microsoft.com/office/word/2010/wordml" xmlns:w15="http://schemas.microsoft.com/office/word/2012/wordml" xmlns:w16se="http://schemas.microsoft.com/office/word/2015/wordml/symex" xmlns:wpg="http://schemas.microsoft.com/office/word/2010/wordprocessingGroup" xmlns:wpi="http://schemas.microsoft.com/office/word/2010/wordprocessingInk" xmlns:wne="http://schemas.microsoft.com/office/word/2006/wordml" xmlns:wps="http://schemas.microsoft.com/office/word/2010/wordprocessingShape" mc:Ignorable="w14 w15 w16se wp14">
+<w:numbering xmlns:wpc="http://schemas.microsoft.com/office/word/2010/wordprocessingCanvas" xmlns:cx="http://schemas.microsoft.com/office/drawing/2014/chartex" xmlns:cx1="http://schemas.microsoft.com/office/drawing/2015/9/8/chartex" xmlns:cx2="http://schemas.microsoft.com/office/drawing/2015/10/21/chartex" xmlns:cx3="http://schemas.microsoft.com/office/drawing/2016/5/9/chartex" xmlns:cx4="http://schemas.microsoft.com/office/drawing/2016/5/10/chartex" xmlns:cx5="http://schemas.microsoft.com/office/drawing/2016/5/11/chartex" xmlns:cx6="http://schemas.microsoft.com/office/drawing/2016/5/12/chartex" xmlns:cx7="http://schemas.microsoft.com/office/drawing/2016/5/13/chartex" xmlns:cx8="http://schemas.microsoft.com/office/drawing/2016/5/14/chartex" xmlns:mc="http://schemas.openxmlformats.org/markup-compatibility/2006" xmlns:aink="http://schemas.microsoft.com/office/drawing/2016/ink" xmlns:am3d="http://schemas.microsoft.com/office/drawing/2017/model3d" xmlns:o="urn:schemas-microsoft-com:office:office" xmlns:oel="http://schemas.microsoft.com/office/2019/extlst" xmlns:r="http://schemas.openxmlformats.org/officeDocument/2006/relationships" xmlns:m="http://schemas.openxmlformats.org/officeDocument/2006/math" xmlns:v="urn:schemas-microsoft-com:vml" xmlns:wp14="http://schemas.microsoft.com/office/word/2010/wordprocessingDrawing" xmlns:wp="http://schemas.openxmlformats.org/drawingml/2006/wordprocessingDrawing" xmlns:w10="urn:schemas-microsoft-com:office:word" xmlns:w="http://schemas.openxmlformats.org/wordprocessingml/2006/main" xmlns:w14="http://schemas.microsoft.com/office/word/2010/wordml" xmlns:w15="http://schemas.microsoft.com/office/word/2012/wordml" xmlns:w16cex="http://schemas.microsoft.com/office/word/2018/wordml/cex" xmlns:w16cid="http://schemas.microsoft.com/office/word/2016/wordml/cid" xmlns:w16="http://schemas.microsoft.com/office/word/2018/wordml" xmlns:w16du="http://schemas.microsoft.com/office/word/2023/wordml/word16du" xmlns:w16sdtdh="http://schemas.microsoft.com/office/word/2020/wordml/sdtdatahash" xmlns:w16sdtfl="http://schemas.microsoft.com/office/word/2024/wordml/sdtformatlock" xmlns:w16se="http://schemas.microsoft.com/office/word/2015/wordml/symex" xmlns:wpg="http://schemas.microsoft.com/office/word/2010/wordprocessingGroup" xmlns:wpi="http://schemas.microsoft.com/office/word/2010/wordprocessingInk" xmlns:wne="http://schemas.microsoft.com/office/word/2006/wordml" xmlns:wps="http://schemas.microsoft.com/office/word/2010/wordprocessingShape" mc:Ignorable="w14 w15 w16se w16cid w16 w16cex w16sdtdh w16sdtfl w16du wp14">
   <w:abstractNum w:abstractNumId="0" w15:restartNumberingAfterBreak="0">
     <w:nsid w:val="FFFFFF7C"/>
     <w:multiLevelType w:val="singleLevel"/>
@@ -7776,119 +6922,119 @@
       </w:rPr>
     </w:lvl>
   </w:abstractNum>
-  <w:num w:numId="1">
+  <w:num w:numId="1" w16cid:durableId="616791023">
     <w:abstractNumId w:val="10"/>
   </w:num>
-  <w:num w:numId="2">
+  <w:num w:numId="2" w16cid:durableId="1558129172">
     <w:abstractNumId w:val="18"/>
   </w:num>
-  <w:num w:numId="3">
+  <w:num w:numId="3" w16cid:durableId="694500273">
     <w:abstractNumId w:val="17"/>
   </w:num>
-  <w:num w:numId="4">
+  <w:num w:numId="4" w16cid:durableId="2017075614">
     <w:abstractNumId w:val="14"/>
   </w:num>
-  <w:num w:numId="5">
+  <w:num w:numId="5" w16cid:durableId="1290891574">
     <w:abstractNumId w:val="26"/>
   </w:num>
-  <w:num w:numId="6">
+  <w:num w:numId="6" w16cid:durableId="1544636237">
     <w:abstractNumId w:val="19"/>
   </w:num>
-  <w:num w:numId="7">
+  <w:num w:numId="7" w16cid:durableId="1566530169">
     <w:abstractNumId w:val="34"/>
   </w:num>
-  <w:num w:numId="8">
+  <w:num w:numId="8" w16cid:durableId="443697624">
     <w:abstractNumId w:val="29"/>
   </w:num>
-  <w:num w:numId="9">
+  <w:num w:numId="9" w16cid:durableId="1772890094">
     <w:abstractNumId w:val="28"/>
   </w:num>
-  <w:num w:numId="10">
+  <w:num w:numId="10" w16cid:durableId="1177770231">
     <w:abstractNumId w:val="21"/>
   </w:num>
-  <w:num w:numId="11">
+  <w:num w:numId="11" w16cid:durableId="345793167">
     <w:abstractNumId w:val="12"/>
   </w:num>
-  <w:num w:numId="12">
+  <w:num w:numId="12" w16cid:durableId="861476819">
     <w:abstractNumId w:val="9"/>
   </w:num>
-  <w:num w:numId="13">
+  <w:num w:numId="13" w16cid:durableId="1793281288">
     <w:abstractNumId w:val="7"/>
   </w:num>
-  <w:num w:numId="14">
+  <w:num w:numId="14" w16cid:durableId="1383286023">
     <w:abstractNumId w:val="6"/>
   </w:num>
-  <w:num w:numId="15">
+  <w:num w:numId="15" w16cid:durableId="1537309074">
     <w:abstractNumId w:val="5"/>
   </w:num>
-  <w:num w:numId="16">
+  <w:num w:numId="16" w16cid:durableId="1278297832">
     <w:abstractNumId w:val="4"/>
   </w:num>
-  <w:num w:numId="17">
+  <w:num w:numId="17" w16cid:durableId="1948584324">
     <w:abstractNumId w:val="8"/>
   </w:num>
-  <w:num w:numId="18">
+  <w:num w:numId="18" w16cid:durableId="1250693431">
     <w:abstractNumId w:val="3"/>
   </w:num>
-  <w:num w:numId="19">
+  <w:num w:numId="19" w16cid:durableId="981151282">
     <w:abstractNumId w:val="2"/>
   </w:num>
-  <w:num w:numId="20">
+  <w:num w:numId="20" w16cid:durableId="2023779324">
     <w:abstractNumId w:val="1"/>
   </w:num>
-  <w:num w:numId="21">
+  <w:num w:numId="21" w16cid:durableId="1159618766">
     <w:abstractNumId w:val="0"/>
   </w:num>
-  <w:num w:numId="22">
+  <w:num w:numId="22" w16cid:durableId="1122916073">
     <w:abstractNumId w:val="35"/>
   </w:num>
-  <w:num w:numId="23">
+  <w:num w:numId="23" w16cid:durableId="271716009">
     <w:abstractNumId w:val="20"/>
   </w:num>
-  <w:num w:numId="24">
+  <w:num w:numId="24" w16cid:durableId="1039623513">
     <w:abstractNumId w:val="11"/>
   </w:num>
-  <w:num w:numId="25">
+  <w:num w:numId="25" w16cid:durableId="1324318181">
     <w:abstractNumId w:val="24"/>
   </w:num>
-  <w:num w:numId="26">
+  <w:num w:numId="26" w16cid:durableId="1293901809">
     <w:abstractNumId w:val="23"/>
   </w:num>
-  <w:num w:numId="27">
+  <w:num w:numId="27" w16cid:durableId="2076278366">
     <w:abstractNumId w:val="15"/>
   </w:num>
-  <w:num w:numId="28">
+  <w:num w:numId="28" w16cid:durableId="139812496">
     <w:abstractNumId w:val="31"/>
   </w:num>
-  <w:num w:numId="29">
+  <w:num w:numId="29" w16cid:durableId="879167225">
     <w:abstractNumId w:val="13"/>
   </w:num>
-  <w:num w:numId="30">
+  <w:num w:numId="30" w16cid:durableId="398285704">
     <w:abstractNumId w:val="27"/>
   </w:num>
-  <w:num w:numId="31">
+  <w:num w:numId="31" w16cid:durableId="96874416">
     <w:abstractNumId w:val="16"/>
   </w:num>
-  <w:num w:numId="32">
+  <w:num w:numId="32" w16cid:durableId="1901288017">
     <w:abstractNumId w:val="22"/>
   </w:num>
-  <w:num w:numId="33">
+  <w:num w:numId="33" w16cid:durableId="1598100802">
     <w:abstractNumId w:val="30"/>
   </w:num>
-  <w:num w:numId="34">
+  <w:num w:numId="34" w16cid:durableId="1672758673">
     <w:abstractNumId w:val="33"/>
   </w:num>
-  <w:num w:numId="35">
+  <w:num w:numId="35" w16cid:durableId="50154915">
     <w:abstractNumId w:val="25"/>
   </w:num>
-  <w:num w:numId="36">
+  <w:num w:numId="36" w16cid:durableId="1832943215">
     <w:abstractNumId w:val="32"/>
   </w:num>
 </w:numbering>
 </file>
 
 <file path=word/styles.xml><?xml version="1.0" encoding="utf-8"?>
-<w:styles xmlns:mc="http://schemas.openxmlformats.org/markup-compatibility/2006" xmlns:r="http://schemas.openxmlformats.org/officeDocument/2006/relationships" xmlns:w="http://schemas.openxmlformats.org/wordprocessingml/2006/main" xmlns:w14="http://schemas.microsoft.com/office/word/2010/wordml" xmlns:w15="http://schemas.microsoft.com/office/word/2012/wordml" xmlns:w16se="http://schemas.microsoft.com/office/word/2015/wordml/symex" mc:Ignorable="w14 w15 w16se">
+<w:styles xmlns:mc="http://schemas.openxmlformats.org/markup-compatibility/2006" xmlns:r="http://schemas.openxmlformats.org/officeDocument/2006/relationships" xmlns:w="http://schemas.openxmlformats.org/wordprocessingml/2006/main" xmlns:w14="http://schemas.microsoft.com/office/word/2010/wordml" xmlns:w15="http://schemas.microsoft.com/office/word/2012/wordml" xmlns:w16cex="http://schemas.microsoft.com/office/word/2018/wordml/cex" xmlns:w16cid="http://schemas.microsoft.com/office/word/2016/wordml/cid" xmlns:w16="http://schemas.microsoft.com/office/word/2018/wordml" xmlns:w16du="http://schemas.microsoft.com/office/word/2023/wordml/word16du" xmlns:w16sdtdh="http://schemas.microsoft.com/office/word/2020/wordml/sdtdatahash" xmlns:w16sdtfl="http://schemas.microsoft.com/office/word/2024/wordml/sdtformatlock" xmlns:w16se="http://schemas.microsoft.com/office/word/2015/wordml/symex" mc:Ignorable="w14 w15 w16se w16cid w16 w16cex w16sdtdh w16sdtfl w16du">
   <w:docDefaults>
     <w:rPrDefault>
       <w:rPr>
@@ -7898,7 +7044,7 @@
     </w:rPrDefault>
     <w:pPrDefault/>
   </w:docDefaults>
-  <w:latentStyles w:defLockedState="0" w:defUIPriority="0" w:defSemiHidden="0" w:defUnhideWhenUsed="0" w:defQFormat="0" w:count="371">
+  <w:latentStyles w:defLockedState="0" w:defUIPriority="0" w:defSemiHidden="0" w:defUnhideWhenUsed="0" w:defQFormat="0" w:count="376">
     <w:lsdException w:name="heading 2" w:semiHidden="1" w:unhideWhenUsed="1" w:qFormat="1"/>
     <w:lsdException w:name="heading 3" w:semiHidden="1" w:unhideWhenUsed="1" w:qFormat="1"/>
     <w:lsdException w:name="heading 4" w:semiHidden="1" w:unhideWhenUsed="1" w:qFormat="1"/>
@@ -8257,6 +7403,11 @@
     <w:lsdException w:name="List Table 5 Dark Accent 6" w:uiPriority="50"/>
     <w:lsdException w:name="List Table 6 Colorful Accent 6" w:uiPriority="51"/>
     <w:lsdException w:name="List Table 7 Colorful Accent 6" w:uiPriority="52"/>
+    <w:lsdException w:name="Mention" w:semiHidden="1" w:uiPriority="99" w:unhideWhenUsed="1"/>
+    <w:lsdException w:name="Smart Hyperlink" w:semiHidden="1" w:uiPriority="99" w:unhideWhenUsed="1"/>
+    <w:lsdException w:name="Hashtag" w:semiHidden="1" w:uiPriority="99" w:unhideWhenUsed="1"/>
+    <w:lsdException w:name="Unresolved Mention" w:semiHidden="1" w:uiPriority="99" w:unhideWhenUsed="1"/>
+    <w:lsdException w:name="Smart Link" w:semiHidden="1" w:uiPriority="99" w:unhideWhenUsed="1"/>
   </w:latentStyles>
   <w:style w:type="paragraph" w:default="1" w:styleId="Normal">
     <w:name w:val="Normal"/>

</xml_diff>